<commit_message>
Title: Excel to Word converter improvements
Key features implemented:
- Updated excel_to_word.py to filter out Unnamed columns during data processing
- Added header detection starting from row 6 or later in Excel sheets
- Implemented automatic PK and FK detection with naming pattern recognition
- Added column uniqueness analysis with statistics calculation
- Enhanced Word report generation with PK/FK indicators and uniqueness percentages
- Integrated inter-sheet relationship analysis showing potential PK-FK connections
- Modified .gitignore to exclude output directory and add log files

The script now provides comprehensive data profiling with key type detection and cross-sheet relationship mapping while maintaining clean output formatting.
</commit_message>
<xml_diff>
--- a/output/esklp/word_reports/esklp_full_report.docx
+++ b/output/esklp/word_reports/esklp_full_report.docx
@@ -19,7 +19,7 @@
         <w:rPr>
           <w:i/>
         </w:rPr>
-        <w:t>Дата формирования: 2026-05-07 07:05:52</w:t>
+        <w:t>Дата формирования: 2026-05-07 07:32:25</w:t>
       </w:r>
     </w:p>
     <w:p>
@@ -56,7 +56,7 @@
         <w:pStyle w:val="ListBullet"/>
       </w:pPr>
       <w:r>
-        <w:t>Суммарное количество записей во всех листах: 33,630</w:t>
+        <w:t>Суммарное количество записей во всех листах: 33,625</w:t>
       </w:r>
     </w:p>
     <w:p>
@@ -64,7 +64,7 @@
         <w:pStyle w:val="ListBullet"/>
       </w:pPr>
       <w:r>
-        <w:t>Суммарное количество колонок во всех листах: 63</w:t>
+        <w:t>Суммарное количество колонок во всех листах: 35</w:t>
       </w:r>
     </w:p>
     <w:p>
@@ -72,7 +72,7 @@
         <w:pStyle w:val="ListBullet"/>
       </w:pPr>
       <w:r>
-        <w:t>Средний размер листа: 33,630.0 записей</w:t>
+        <w:t>Средний размер листа: 33,625.0 записей</w:t>
       </w:r>
     </w:p>
     <w:p>
@@ -180,7 +180,7 @@
           </w:tcPr>
           <w:p>
             <w:r>
-              <w:t>33,630</w:t>
+              <w:t>33,625</w:t>
             </w:r>
           </w:p>
         </w:tc>
@@ -190,7 +190,7 @@
           </w:tcPr>
           <w:p>
             <w:r>
-              <w:t>63</w:t>
+              <w:t>35</w:t>
             </w:r>
           </w:p>
         </w:tc>
@@ -210,7 +210,7 @@
           </w:tcPr>
           <w:p>
             <w:r>
-              <w:t>3.2%</w:t>
+              <w:t>5.7%</w:t>
             </w:r>
           </w:p>
         </w:tc>
@@ -227,9 +227,26 @@
     </w:p>
     <w:p>
       <w:pPr>
+        <w:pStyle w:val="Heading3"/>
+      </w:pPr>
+      <w:r>
+        <w:t>Потенциальные связи между листами</w:t>
+      </w:r>
+    </w:p>
+    <w:p>
+      <w:pPr>
         <w:pStyle w:val="ListBullet"/>
       </w:pPr>
       <w:r>
+        <w:t>Явные связи PK→FK между листами не найдены. Проверьте общие колонки ниже.</w:t>
+      </w:r>
+    </w:p>
+    <w:p>
+      <w:pPr>
+        <w:pStyle w:val="ListBullet"/>
+      </w:pPr>
+      <w:r>
+        <w:br/>
         <w:t>Поиск общих колонок между листами:</w:t>
       </w:r>
     </w:p>
@@ -245,22 +262,6 @@
       <w:r>
         <w:br/>
         <w:t>Потенциальные связи по ключевым полям:</w:t>
-      </w:r>
-    </w:p>
-    <w:p>
-      <w:pPr>
-        <w:pStyle w:val="ListBullet"/>
-      </w:pPr>
-      <w:r>
-        <w:t>• Поле типа 'наименование': Лист1(Наименование), Лист1(НаименованиеИностранное), Лист1(НаименованиеПолное), Лист1(ТорговоеНаименование)</w:t>
-      </w:r>
-    </w:p>
-    <w:p>
-      <w:pPr>
-        <w:pStyle w:val="ListBullet"/>
-      </w:pPr>
-      <w:r>
-        <w:t>• Поле типа 'код': Лист1(КодТНВЭД), Лист1(ор_КодРосздравнадзора), Лист1(КодВидаНоменклатурнойКлассификации), Лист1(КодОКПД2), Лист1(КодКЛП) и еще 1</w:t>
       </w:r>
     </w:p>
     <w:p>
@@ -310,7 +311,7 @@
         <w:pStyle w:val="ListBullet"/>
       </w:pPr>
       <w:r>
-        <w:t>Всего записей: 33,630</w:t>
+        <w:t>Всего записей: 33,625</w:t>
       </w:r>
     </w:p>
     <w:p>
@@ -318,7 +319,7 @@
         <w:pStyle w:val="ListBullet"/>
       </w:pPr>
       <w:r>
-        <w:t>Всего колонок: 63</w:t>
+        <w:t>Всего колонок: 35</w:t>
       </w:r>
     </w:p>
     <w:p>
@@ -334,7 +335,7 @@
         <w:pStyle w:val="ListBullet"/>
       </w:pPr>
       <w:r>
-        <w:t>Колонок с пропусками: 61</w:t>
+        <w:t>Колонок с пропусками: 33</w:t>
       </w:r>
     </w:p>
     <w:p>
@@ -352,16 +353,18 @@
         <w:tblLook w:firstColumn="1" w:firstRow="1" w:lastColumn="0" w:lastRow="0" w:noHBand="0" w:noVBand="1" w:val="04A0"/>
       </w:tblPr>
       <w:tblGrid>
-        <w:gridCol w:w="1728"/>
-        <w:gridCol w:w="1728"/>
-        <w:gridCol w:w="1728"/>
-        <w:gridCol w:w="1728"/>
-        <w:gridCol w:w="1728"/>
+        <w:gridCol w:w="1234"/>
+        <w:gridCol w:w="1234"/>
+        <w:gridCol w:w="1234"/>
+        <w:gridCol w:w="1234"/>
+        <w:gridCol w:w="1234"/>
+        <w:gridCol w:w="1234"/>
+        <w:gridCol w:w="1234"/>
       </w:tblGrid>
       <w:tr>
         <w:tc>
           <w:tcPr>
-            <w:tcW w:type="dxa" w:w="1728"/>
+            <w:tcW w:type="dxa" w:w="1234"/>
           </w:tcPr>
           <w:p>
             <w:r>
@@ -374,7 +377,20 @@
         </w:tc>
         <w:tc>
           <w:tcPr>
-            <w:tcW w:type="dxa" w:w="1728"/>
+            <w:tcW w:type="dxa" w:w="1234"/>
+          </w:tcPr>
+          <w:p>
+            <w:r>
+              <w:rPr>
+                <w:b/>
+              </w:rPr>
+              <w:t>Тип ключа</w:t>
+            </w:r>
+          </w:p>
+        </w:tc>
+        <w:tc>
+          <w:tcPr>
+            <w:tcW w:type="dxa" w:w="1234"/>
           </w:tcPr>
           <w:p>
             <w:r>
@@ -387,7 +403,7 @@
         </w:tc>
         <w:tc>
           <w:tcPr>
-            <w:tcW w:type="dxa" w:w="1728"/>
+            <w:tcW w:type="dxa" w:w="1234"/>
           </w:tcPr>
           <w:p>
             <w:r>
@@ -400,7 +416,7 @@
         </w:tc>
         <w:tc>
           <w:tcPr>
-            <w:tcW w:type="dxa" w:w="1728"/>
+            <w:tcW w:type="dxa" w:w="1234"/>
           </w:tcPr>
           <w:p>
             <w:r>
@@ -413,7 +429,20 @@
         </w:tc>
         <w:tc>
           <w:tcPr>
-            <w:tcW w:type="dxa" w:w="1728"/>
+            <w:tcW w:type="dxa" w:w="1234"/>
+          </w:tcPr>
+          <w:p>
+            <w:r>
+              <w:rPr>
+                <w:b/>
+              </w:rPr>
+              <w:t>% уникальности</w:t>
+            </w:r>
+          </w:p>
+        </w:tc>
+        <w:tc>
+          <w:tcPr>
+            <w:tcW w:type="dxa" w:w="1234"/>
           </w:tcPr>
           <w:p>
             <w:r>
@@ -428,27 +457,37 @@
       <w:tr>
         <w:tc>
           <w:tcPr>
-            <w:tcW w:type="dxa" w:w="1728"/>
+            <w:tcW w:type="dxa" w:w="1234"/>
           </w:tcPr>
           <w:p>
             <w:r>
-              <w:t>GUID</w:t>
+              <w:t>15710750-bca1-11ef-967d-fa163eeaff70</w:t>
             </w:r>
           </w:p>
         </w:tc>
         <w:tc>
           <w:tcPr>
-            <w:tcW w:type="dxa" w:w="1728"/>
+            <w:tcW w:type="dxa" w:w="1234"/>
           </w:tcPr>
           <w:p>
             <w:r>
-              <w:t>33630</w:t>
+              <w:t>Potential PK</w:t>
             </w:r>
           </w:p>
         </w:tc>
         <w:tc>
           <w:tcPr>
-            <w:tcW w:type="dxa" w:w="1728"/>
+            <w:tcW w:type="dxa" w:w="1234"/>
+          </w:tcPr>
+          <w:p>
+            <w:r>
+              <w:t>33625</w:t>
+            </w:r>
+          </w:p>
+        </w:tc>
+        <w:tc>
+          <w:tcPr>
+            <w:tcW w:type="dxa" w:w="1234"/>
           </w:tcPr>
           <w:p>
             <w:r>
@@ -458,7 +497,7 @@
         </w:tc>
         <w:tc>
           <w:tcPr>
-            <w:tcW w:type="dxa" w:w="1728"/>
+            <w:tcW w:type="dxa" w:w="1234"/>
           </w:tcPr>
           <w:p>
             <w:r>
@@ -468,11 +507,21 @@
         </w:tc>
         <w:tc>
           <w:tcPr>
-            <w:tcW w:type="dxa" w:w="1728"/>
+            <w:tcW w:type="dxa" w:w="1234"/>
           </w:tcPr>
           <w:p>
             <w:r>
-              <w:t>3761a6e4-ba62-11ef-967d-fa163eeaff70</w:t>
+              <w:t>100.0%</w:t>
+            </w:r>
+          </w:p>
+        </w:tc>
+        <w:tc>
+          <w:tcPr>
+            <w:tcW w:type="dxa" w:w="1234"/>
+          </w:tcPr>
+          <w:p>
+            <w:r>
+              <w:t>3bfbf916-ba62-11ef-967d-fa163eeaff70</w:t>
             </w:r>
           </w:p>
         </w:tc>
@@ -480,27 +529,37 @@
       <w:tr>
         <w:tc>
           <w:tcPr>
-            <w:tcW w:type="dxa" w:w="1728"/>
+            <w:tcW w:type="dxa" w:w="1234"/>
           </w:tcPr>
           <w:p>
             <w:r>
-              <w:t>Ссылка</w:t>
+              <w:t>Вольтарен, табл. п.кишечнораствор.о. 25 мг, бл. 10</w:t>
             </w:r>
           </w:p>
         </w:tc>
         <w:tc>
           <w:tcPr>
-            <w:tcW w:type="dxa" w:w="1728"/>
+            <w:tcW w:type="dxa" w:w="1234"/>
           </w:tcPr>
           <w:p>
             <w:r>
-              <w:t>33630</w:t>
+              <w:t>-</w:t>
             </w:r>
           </w:p>
         </w:tc>
         <w:tc>
           <w:tcPr>
-            <w:tcW w:type="dxa" w:w="1728"/>
+            <w:tcW w:type="dxa" w:w="1234"/>
+          </w:tcPr>
+          <w:p>
+            <w:r>
+              <w:t>33625</w:t>
+            </w:r>
+          </w:p>
+        </w:tc>
+        <w:tc>
+          <w:tcPr>
+            <w:tcW w:type="dxa" w:w="1234"/>
           </w:tcPr>
           <w:p>
             <w:r>
@@ -510,7 +569,7 @@
         </w:tc>
         <w:tc>
           <w:tcPr>
-            <w:tcW w:type="dxa" w:w="1728"/>
+            <w:tcW w:type="dxa" w:w="1234"/>
           </w:tcPr>
           <w:p>
             <w:r>
@@ -520,11 +579,21 @@
         </w:tc>
         <w:tc>
           <w:tcPr>
-            <w:tcW w:type="dxa" w:w="1728"/>
+            <w:tcW w:type="dxa" w:w="1234"/>
           </w:tcPr>
           <w:p>
             <w:r>
-              <w:t>Солифенацин Канон, табл. п.п.о. 10 мг, бл. 30, пач</w:t>
+              <w:t>93.24%</w:t>
+            </w:r>
+          </w:p>
+        </w:tc>
+        <w:tc>
+          <w:tcPr>
+            <w:tcW w:type="dxa" w:w="1234"/>
+          </w:tcPr>
+          <w:p>
+            <w:r>
+              <w:t>Ацесоль, р-р д/инф., бан. 200 мл, кор. 28</w:t>
             </w:r>
           </w:p>
         </w:tc>
@@ -532,27 +601,37 @@
       <w:tr>
         <w:tc>
           <w:tcPr>
-            <w:tcW w:type="dxa" w:w="1728"/>
+            <w:tcW w:type="dxa" w:w="1234"/>
           </w:tcPr>
           <w:p>
             <w:r>
-              <w:t>Наименование</w:t>
+              <w:t>Вольтарен, табл. п.кишечнораствор.о. 25 мг, бл. 10</w:t>
             </w:r>
           </w:p>
         </w:tc>
         <w:tc>
           <w:tcPr>
-            <w:tcW w:type="dxa" w:w="1728"/>
+            <w:tcW w:type="dxa" w:w="1234"/>
           </w:tcPr>
           <w:p>
             <w:r>
-              <w:t>33629</w:t>
+              <w:t>-</w:t>
             </w:r>
           </w:p>
         </w:tc>
         <w:tc>
           <w:tcPr>
-            <w:tcW w:type="dxa" w:w="1728"/>
+            <w:tcW w:type="dxa" w:w="1234"/>
+          </w:tcPr>
+          <w:p>
+            <w:r>
+              <w:t>33624</w:t>
+            </w:r>
+          </w:p>
+        </w:tc>
+        <w:tc>
+          <w:tcPr>
+            <w:tcW w:type="dxa" w:w="1234"/>
           </w:tcPr>
           <w:p>
             <w:r>
@@ -562,7 +641,7 @@
         </w:tc>
         <w:tc>
           <w:tcPr>
-            <w:tcW w:type="dxa" w:w="1728"/>
+            <w:tcW w:type="dxa" w:w="1234"/>
           </w:tcPr>
           <w:p>
             <w:r>
@@ -572,11 +651,21 @@
         </w:tc>
         <w:tc>
           <w:tcPr>
-            <w:tcW w:type="dxa" w:w="1728"/>
+            <w:tcW w:type="dxa" w:w="1234"/>
           </w:tcPr>
           <w:p>
             <w:r>
-              <w:t>Солифенацин Канон, табл. п.п.о. 10 мг, бл. 30, пач</w:t>
+              <w:t>93.24%</w:t>
+            </w:r>
+          </w:p>
+        </w:tc>
+        <w:tc>
+          <w:tcPr>
+            <w:tcW w:type="dxa" w:w="1234"/>
+          </w:tcPr>
+          <w:p>
+            <w:r>
+              <w:t>Ацесоль, р-р д/инф., бан. 200 мл, кор. 28</w:t>
             </w:r>
           </w:p>
         </w:tc>
@@ -584,37 +673,47 @@
       <w:tr>
         <w:tc>
           <w:tcPr>
-            <w:tcW w:type="dxa" w:w="1728"/>
+            <w:tcW w:type="dxa" w:w="1234"/>
           </w:tcPr>
           <w:p>
             <w:r>
-              <w:t>НаименованиеИностранное</w:t>
+              <w:t>Вольтарен табл. п.кишечнораствор.о. 25 мг №30</w:t>
             </w:r>
           </w:p>
         </w:tc>
         <w:tc>
           <w:tcPr>
-            <w:tcW w:type="dxa" w:w="1728"/>
+            <w:tcW w:type="dxa" w:w="1234"/>
           </w:tcPr>
           <w:p>
             <w:r>
-              <w:t>9041</w:t>
+              <w:t>-</w:t>
             </w:r>
           </w:p>
         </w:tc>
         <w:tc>
           <w:tcPr>
-            <w:tcW w:type="dxa" w:w="1728"/>
+            <w:tcW w:type="dxa" w:w="1234"/>
           </w:tcPr>
           <w:p>
             <w:r>
-              <w:t>24589</w:t>
+              <w:t>9040</w:t>
             </w:r>
           </w:p>
         </w:tc>
         <w:tc>
           <w:tcPr>
-            <w:tcW w:type="dxa" w:w="1728"/>
+            <w:tcW w:type="dxa" w:w="1234"/>
+          </w:tcPr>
+          <w:p>
+            <w:r>
+              <w:t>24585</w:t>
+            </w:r>
+          </w:p>
+        </w:tc>
+        <w:tc>
+          <w:tcPr>
+            <w:tcW w:type="dxa" w:w="1234"/>
           </w:tcPr>
           <w:p>
             <w:r>
@@ -624,11 +723,21 @@
         </w:tc>
         <w:tc>
           <w:tcPr>
-            <w:tcW w:type="dxa" w:w="1728"/>
+            <w:tcW w:type="dxa" w:w="1234"/>
           </w:tcPr>
           <w:p>
             <w:r>
-              <w:t>Вольтарен табл. п.кишечнораствор.о. 25 мг №30</w:t>
+              <w:t>96.83%</w:t>
+            </w:r>
+          </w:p>
+        </w:tc>
+        <w:tc>
+          <w:tcPr>
+            <w:tcW w:type="dxa" w:w="1234"/>
+          </w:tcPr>
+          <w:p>
+            <w:r>
+              <w:t>Фороза, табл. п.п.о. 70 мг, бл. 4, пач. картон. 3</w:t>
             </w:r>
           </w:p>
         </w:tc>
@@ -636,27 +745,37 @@
       <w:tr>
         <w:tc>
           <w:tcPr>
-            <w:tcW w:type="dxa" w:w="1728"/>
+            <w:tcW w:type="dxa" w:w="1234"/>
           </w:tcPr>
           <w:p>
             <w:r>
-              <w:t>НаименованиеПолное</w:t>
+              <w:t>Вольтарен, табл. п.кишечнораствор.о. 25 мг, бл. 10</w:t>
             </w:r>
           </w:p>
         </w:tc>
         <w:tc>
           <w:tcPr>
-            <w:tcW w:type="dxa" w:w="1728"/>
+            <w:tcW w:type="dxa" w:w="1234"/>
           </w:tcPr>
           <w:p>
             <w:r>
-              <w:t>29272</w:t>
+              <w:t>-</w:t>
             </w:r>
           </w:p>
         </w:tc>
         <w:tc>
           <w:tcPr>
-            <w:tcW w:type="dxa" w:w="1728"/>
+            <w:tcW w:type="dxa" w:w="1234"/>
+          </w:tcPr>
+          <w:p>
+            <w:r>
+              <w:t>29267</w:t>
+            </w:r>
+          </w:p>
+        </w:tc>
+        <w:tc>
+          <w:tcPr>
+            <w:tcW w:type="dxa" w:w="1234"/>
           </w:tcPr>
           <w:p>
             <w:r>
@@ -666,7 +785,7 @@
         </w:tc>
         <w:tc>
           <w:tcPr>
-            <w:tcW w:type="dxa" w:w="1728"/>
+            <w:tcW w:type="dxa" w:w="1234"/>
           </w:tcPr>
           <w:p>
             <w:r>
@@ -676,11 +795,21 @@
         </w:tc>
         <w:tc>
           <w:tcPr>
-            <w:tcW w:type="dxa" w:w="1728"/>
+            <w:tcW w:type="dxa" w:w="1234"/>
           </w:tcPr>
           <w:p>
             <w:r>
-              <w:t>Солифенацин Канон, табл. п.п.о. 10 мг, бл. 30, пач</w:t>
+              <w:t>91.81%</w:t>
+            </w:r>
+          </w:p>
+        </w:tc>
+        <w:tc>
+          <w:tcPr>
+            <w:tcW w:type="dxa" w:w="1234"/>
+          </w:tcPr>
+          <w:p>
+            <w:r>
+              <w:t>Ацесоль, р-р д/инф., бан. 200 мл, кор. 28</w:t>
             </w:r>
           </w:p>
         </w:tc>
@@ -688,27 +817,37 @@
       <w:tr>
         <w:tc>
           <w:tcPr>
-            <w:tcW w:type="dxa" w:w="1728"/>
+            <w:tcW w:type="dxa" w:w="1234"/>
           </w:tcPr>
           <w:p>
             <w:r>
-              <w:t>ВидНоменклатуры</w:t>
+              <w:t>Товар</w:t>
             </w:r>
           </w:p>
         </w:tc>
         <w:tc>
           <w:tcPr>
-            <w:tcW w:type="dxa" w:w="1728"/>
+            <w:tcW w:type="dxa" w:w="1234"/>
           </w:tcPr>
           <w:p>
             <w:r>
-              <w:t>33627</w:t>
+              <w:t>-</w:t>
             </w:r>
           </w:p>
         </w:tc>
         <w:tc>
           <w:tcPr>
-            <w:tcW w:type="dxa" w:w="1728"/>
+            <w:tcW w:type="dxa" w:w="1234"/>
+          </w:tcPr>
+          <w:p>
+            <w:r>
+              <w:t>33622</w:t>
+            </w:r>
+          </w:p>
+        </w:tc>
+        <w:tc>
+          <w:tcPr>
+            <w:tcW w:type="dxa" w:w="1234"/>
           </w:tcPr>
           <w:p>
             <w:r>
@@ -718,7 +857,7 @@
         </w:tc>
         <w:tc>
           <w:tcPr>
-            <w:tcW w:type="dxa" w:w="1728"/>
+            <w:tcW w:type="dxa" w:w="1234"/>
           </w:tcPr>
           <w:p>
             <w:r>
@@ -728,7 +867,17 @@
         </w:tc>
         <w:tc>
           <w:tcPr>
-            <w:tcW w:type="dxa" w:w="1728"/>
+            <w:tcW w:type="dxa" w:w="1234"/>
+          </w:tcPr>
+          <w:p>
+            <w:r>
+              <w:t>0.01%</w:t>
+            </w:r>
+          </w:p>
+        </w:tc>
+        <w:tc>
+          <w:tcPr>
+            <w:tcW w:type="dxa" w:w="1234"/>
           </w:tcPr>
           <w:p>
             <w:r>
@@ -740,27 +889,37 @@
       <w:tr>
         <w:tc>
           <w:tcPr>
-            <w:tcW w:type="dxa" w:w="1728"/>
+            <w:tcW w:type="dxa" w:w="1234"/>
           </w:tcPr>
           <w:p>
             <w:r>
-              <w:t>БазоваяЕдиницаИзмерения</w:t>
+              <w:t>шт</w:t>
             </w:r>
           </w:p>
         </w:tc>
         <w:tc>
           <w:tcPr>
-            <w:tcW w:type="dxa" w:w="1728"/>
+            <w:tcW w:type="dxa" w:w="1234"/>
           </w:tcPr>
           <w:p>
             <w:r>
-              <w:t>33237</w:t>
+              <w:t>-</w:t>
             </w:r>
           </w:p>
         </w:tc>
         <w:tc>
           <w:tcPr>
-            <w:tcW w:type="dxa" w:w="1728"/>
+            <w:tcW w:type="dxa" w:w="1234"/>
+          </w:tcPr>
+          <w:p>
+            <w:r>
+              <w:t>33232</w:t>
+            </w:r>
+          </w:p>
+        </w:tc>
+        <w:tc>
+          <w:tcPr>
+            <w:tcW w:type="dxa" w:w="1234"/>
           </w:tcPr>
           <w:p>
             <w:r>
@@ -770,7 +929,7 @@
         </w:tc>
         <w:tc>
           <w:tcPr>
-            <w:tcW w:type="dxa" w:w="1728"/>
+            <w:tcW w:type="dxa" w:w="1234"/>
           </w:tcPr>
           <w:p>
             <w:r>
@@ -780,7 +939,17 @@
         </w:tc>
         <w:tc>
           <w:tcPr>
-            <w:tcW w:type="dxa" w:w="1728"/>
+            <w:tcW w:type="dxa" w:w="1234"/>
+          </w:tcPr>
+          <w:p>
+            <w:r>
+              <w:t>0.02%</w:t>
+            </w:r>
+          </w:p>
+        </w:tc>
+        <w:tc>
+          <w:tcPr>
+            <w:tcW w:type="dxa" w:w="1234"/>
           </w:tcPr>
           <w:p>
             <w:r>
@@ -792,27 +961,37 @@
       <w:tr>
         <w:tc>
           <w:tcPr>
-            <w:tcW w:type="dxa" w:w="1728"/>
+            <w:tcW w:type="dxa" w:w="1234"/>
           </w:tcPr>
           <w:p>
             <w:r>
-              <w:t>ОсновнаяЕдиницаИзмерения</w:t>
+              <w:t>уп</w:t>
             </w:r>
           </w:p>
         </w:tc>
         <w:tc>
           <w:tcPr>
-            <w:tcW w:type="dxa" w:w="1728"/>
+            <w:tcW w:type="dxa" w:w="1234"/>
           </w:tcPr>
           <w:p>
             <w:r>
-              <w:t>33510</w:t>
+              <w:t>-</w:t>
             </w:r>
           </w:p>
         </w:tc>
         <w:tc>
           <w:tcPr>
-            <w:tcW w:type="dxa" w:w="1728"/>
+            <w:tcW w:type="dxa" w:w="1234"/>
+          </w:tcPr>
+          <w:p>
+            <w:r>
+              <w:t>33505</w:t>
+            </w:r>
+          </w:p>
+        </w:tc>
+        <w:tc>
+          <w:tcPr>
+            <w:tcW w:type="dxa" w:w="1234"/>
           </w:tcPr>
           <w:p>
             <w:r>
@@ -822,7 +1001,7 @@
         </w:tc>
         <w:tc>
           <w:tcPr>
-            <w:tcW w:type="dxa" w:w="1728"/>
+            <w:tcW w:type="dxa" w:w="1234"/>
           </w:tcPr>
           <w:p>
             <w:r>
@@ -832,7 +1011,17 @@
         </w:tc>
         <w:tc>
           <w:tcPr>
-            <w:tcW w:type="dxa" w:w="1728"/>
+            <w:tcW w:type="dxa" w:w="1234"/>
+          </w:tcPr>
+          <w:p>
+            <w:r>
+              <w:t>0.11%</w:t>
+            </w:r>
+          </w:p>
+        </w:tc>
+        <w:tc>
+          <w:tcPr>
+            <w:tcW w:type="dxa" w:w="1234"/>
           </w:tcPr>
           <w:p>
             <w:r>
@@ -844,27 +1033,37 @@
       <w:tr>
         <w:tc>
           <w:tcPr>
-            <w:tcW w:type="dxa" w:w="1728"/>
+            <w:tcW w:type="dxa" w:w="1234"/>
           </w:tcPr>
           <w:p>
             <w:r>
-              <w:t>СтавкаНДС</w:t>
+              <w:t>10</w:t>
             </w:r>
           </w:p>
         </w:tc>
         <w:tc>
           <w:tcPr>
-            <w:tcW w:type="dxa" w:w="1728"/>
+            <w:tcW w:type="dxa" w:w="1234"/>
           </w:tcPr>
           <w:p>
             <w:r>
-              <w:t>32178</w:t>
+              <w:t>-</w:t>
             </w:r>
           </w:p>
         </w:tc>
         <w:tc>
           <w:tcPr>
-            <w:tcW w:type="dxa" w:w="1728"/>
+            <w:tcW w:type="dxa" w:w="1234"/>
+          </w:tcPr>
+          <w:p>
+            <w:r>
+              <w:t>32173</w:t>
+            </w:r>
+          </w:p>
+        </w:tc>
+        <w:tc>
+          <w:tcPr>
+            <w:tcW w:type="dxa" w:w="1234"/>
           </w:tcPr>
           <w:p>
             <w:r>
@@ -874,7 +1073,7 @@
         </w:tc>
         <w:tc>
           <w:tcPr>
-            <w:tcW w:type="dxa" w:w="1728"/>
+            <w:tcW w:type="dxa" w:w="1234"/>
           </w:tcPr>
           <w:p>
             <w:r>
@@ -884,7 +1083,17 @@
         </w:tc>
         <w:tc>
           <w:tcPr>
-            <w:tcW w:type="dxa" w:w="1728"/>
+            <w:tcW w:type="dxa" w:w="1234"/>
+          </w:tcPr>
+          <w:p>
+            <w:r>
+              <w:t>0.02%</w:t>
+            </w:r>
+          </w:p>
+        </w:tc>
+        <w:tc>
+          <w:tcPr>
+            <w:tcW w:type="dxa" w:w="1234"/>
           </w:tcPr>
           <w:p>
             <w:r>
@@ -896,27 +1105,37 @@
       <w:tr>
         <w:tc>
           <w:tcPr>
-            <w:tcW w:type="dxa" w:w="1728"/>
+            <w:tcW w:type="dxa" w:w="1234"/>
           </w:tcPr>
           <w:p>
             <w:r>
-              <w:t>ВалютаУчета</w:t>
+              <w:t>RUB</w:t>
             </w:r>
           </w:p>
         </w:tc>
         <w:tc>
           <w:tcPr>
-            <w:tcW w:type="dxa" w:w="1728"/>
+            <w:tcW w:type="dxa" w:w="1234"/>
           </w:tcPr>
           <w:p>
             <w:r>
-              <w:t>33627</w:t>
+              <w:t>-</w:t>
             </w:r>
           </w:p>
         </w:tc>
         <w:tc>
           <w:tcPr>
-            <w:tcW w:type="dxa" w:w="1728"/>
+            <w:tcW w:type="dxa" w:w="1234"/>
+          </w:tcPr>
+          <w:p>
+            <w:r>
+              <w:t>33622</w:t>
+            </w:r>
+          </w:p>
+        </w:tc>
+        <w:tc>
+          <w:tcPr>
+            <w:tcW w:type="dxa" w:w="1234"/>
           </w:tcPr>
           <w:p>
             <w:r>
@@ -926,7 +1145,7 @@
         </w:tc>
         <w:tc>
           <w:tcPr>
-            <w:tcW w:type="dxa" w:w="1728"/>
+            <w:tcW w:type="dxa" w:w="1234"/>
           </w:tcPr>
           <w:p>
             <w:r>
@@ -936,7 +1155,17 @@
         </w:tc>
         <w:tc>
           <w:tcPr>
-            <w:tcW w:type="dxa" w:w="1728"/>
+            <w:tcW w:type="dxa" w:w="1234"/>
+          </w:tcPr>
+          <w:p>
+            <w:r>
+              <w:t>0.0%</w:t>
+            </w:r>
+          </w:p>
+        </w:tc>
+        <w:tc>
+          <w:tcPr>
+            <w:tcW w:type="dxa" w:w="1234"/>
           </w:tcPr>
           <w:p>
             <w:r>
@@ -948,77 +1177,37 @@
       <w:tr>
         <w:tc>
           <w:tcPr>
-            <w:tcW w:type="dxa" w:w="1728"/>
+            <w:tcW w:type="dxa" w:w="1234"/>
           </w:tcPr>
           <w:p>
             <w:r>
-              <w:t>ГТД</w:t>
+              <w:t>Турецкая Республика</w:t>
             </w:r>
           </w:p>
         </w:tc>
         <w:tc>
           <w:tcPr>
-            <w:tcW w:type="dxa" w:w="1728"/>
+            <w:tcW w:type="dxa" w:w="1234"/>
           </w:tcPr>
           <w:p>
             <w:r>
-              <w:t>0</w:t>
+              <w:t>-</w:t>
             </w:r>
           </w:p>
         </w:tc>
         <w:tc>
           <w:tcPr>
-            <w:tcW w:type="dxa" w:w="1728"/>
+            <w:tcW w:type="dxa" w:w="1234"/>
           </w:tcPr>
           <w:p>
             <w:r>
-              <w:t>33630</w:t>
+              <w:t>15423</w:t>
             </w:r>
           </w:p>
         </w:tc>
         <w:tc>
           <w:tcPr>
-            <w:tcW w:type="dxa" w:w="1728"/>
-          </w:tcPr>
-          <w:p>
-            <w:r>
-              <w:t>0.0%</w:t>
-            </w:r>
-          </w:p>
-        </w:tc>
-        <w:tc>
-          <w:tcPr>
-            <w:tcW w:type="dxa" w:w="1728"/>
-          </w:tcPr>
-          <w:p>
-            <w:r/>
-          </w:p>
-        </w:tc>
-      </w:tr>
-      <w:tr>
-        <w:tc>
-          <w:tcPr>
-            <w:tcW w:type="dxa" w:w="1728"/>
-          </w:tcPr>
-          <w:p>
-            <w:r>
-              <w:t>СтранаПроисхождения</w:t>
-            </w:r>
-          </w:p>
-        </w:tc>
-        <w:tc>
-          <w:tcPr>
-            <w:tcW w:type="dxa" w:w="1728"/>
-          </w:tcPr>
-          <w:p>
-            <w:r>
-              <w:t>15428</w:t>
-            </w:r>
-          </w:p>
-        </w:tc>
-        <w:tc>
-          <w:tcPr>
-            <w:tcW w:type="dxa" w:w="1728"/>
+            <w:tcW w:type="dxa" w:w="1234"/>
           </w:tcPr>
           <w:p>
             <w:r>
@@ -1028,17 +1217,27 @@
         </w:tc>
         <w:tc>
           <w:tcPr>
-            <w:tcW w:type="dxa" w:w="1728"/>
+            <w:tcW w:type="dxa" w:w="1234"/>
           </w:tcPr>
           <w:p>
             <w:r>
-              <w:t>45.88%</w:t>
+              <w:t>45.87%</w:t>
             </w:r>
           </w:p>
         </w:tc>
         <w:tc>
           <w:tcPr>
-            <w:tcW w:type="dxa" w:w="1728"/>
+            <w:tcW w:type="dxa" w:w="1234"/>
+          </w:tcPr>
+          <w:p>
+            <w:r>
+              <w:t>0.43%</w:t>
+            </w:r>
+          </w:p>
+        </w:tc>
+        <w:tc>
+          <w:tcPr>
+            <w:tcW w:type="dxa" w:w="1234"/>
           </w:tcPr>
           <w:p>
             <w:r>
@@ -1050,131 +1249,37 @@
       <w:tr>
         <w:tc>
           <w:tcPr>
-            <w:tcW w:type="dxa" w:w="1728"/>
+            <w:tcW w:type="dxa" w:w="1234"/>
           </w:tcPr>
           <w:p>
             <w:r>
-              <w:t>СрокХраненияТовара</w:t>
+              <w:t>НОВАРТИС САГЛИК ГИДА ВЕ ТАРИМ ЮРЮНЛЕРИ САНАЙИ ВЕ Т</w:t>
             </w:r>
           </w:p>
         </w:tc>
         <w:tc>
           <w:tcPr>
-            <w:tcW w:type="dxa" w:w="1728"/>
+            <w:tcW w:type="dxa" w:w="1234"/>
           </w:tcPr>
           <w:p>
             <w:r>
-              <w:t>33</w:t>
+              <w:t>-</w:t>
             </w:r>
           </w:p>
         </w:tc>
         <w:tc>
           <w:tcPr>
-            <w:tcW w:type="dxa" w:w="1728"/>
+            <w:tcW w:type="dxa" w:w="1234"/>
           </w:tcPr>
           <w:p>
             <w:r>
-              <w:t>33597</w:t>
+              <w:t>17107</w:t>
             </w:r>
           </w:p>
         </w:tc>
         <w:tc>
           <w:tcPr>
-            <w:tcW w:type="dxa" w:w="1728"/>
-          </w:tcPr>
-          <w:p>
-            <w:r>
-              <w:t>0.1%</w:t>
-            </w:r>
-          </w:p>
-        </w:tc>
-        <w:tc>
-          <w:tcPr>
-            <w:tcW w:type="dxa" w:w="1728"/>
-          </w:tcPr>
-          <w:p>
-            <w:r>
-              <w:t>2027.0</w:t>
-            </w:r>
-          </w:p>
-        </w:tc>
-      </w:tr>
-      <w:tr>
-        <w:tc>
-          <w:tcPr>
-            <w:tcW w:type="dxa" w:w="1728"/>
-          </w:tcPr>
-          <w:p>
-            <w:r>
-              <w:t>ПроцентНаценки</w:t>
-            </w:r>
-          </w:p>
-        </w:tc>
-        <w:tc>
-          <w:tcPr>
-            <w:tcW w:type="dxa" w:w="1728"/>
-          </w:tcPr>
-          <w:p>
-            <w:r>
-              <w:t>32</w:t>
-            </w:r>
-          </w:p>
-        </w:tc>
-        <w:tc>
-          <w:tcPr>
-            <w:tcW w:type="dxa" w:w="1728"/>
-          </w:tcPr>
-          <w:p>
-            <w:r>
-              <w:t>33598</w:t>
-            </w:r>
-          </w:p>
-        </w:tc>
-        <w:tc>
-          <w:tcPr>
-            <w:tcW w:type="dxa" w:w="1728"/>
-          </w:tcPr>
-          <w:p>
-            <w:r>
-              <w:t>0.1%</w:t>
-            </w:r>
-          </w:p>
-        </w:tc>
-        <w:tc>
-          <w:tcPr>
-            <w:tcW w:type="dxa" w:w="1728"/>
-          </w:tcPr>
-          <w:p>
-            <w:r>
-              <w:t>30.0</w:t>
-            </w:r>
-          </w:p>
-        </w:tc>
-      </w:tr>
-      <w:tr>
-        <w:tc>
-          <w:tcPr>
-            <w:tcW w:type="dxa" w:w="1728"/>
-          </w:tcPr>
-          <w:p>
-            <w:r>
-              <w:t>Производитель</w:t>
-            </w:r>
-          </w:p>
-        </w:tc>
-        <w:tc>
-          <w:tcPr>
-            <w:tcW w:type="dxa" w:w="1728"/>
-          </w:tcPr>
-          <w:p>
-            <w:r>
-              <w:t>17112</w:t>
-            </w:r>
-          </w:p>
-        </w:tc>
-        <w:tc>
-          <w:tcPr>
-            <w:tcW w:type="dxa" w:w="1728"/>
+            <w:tcW w:type="dxa" w:w="1234"/>
           </w:tcPr>
           <w:p>
             <w:r>
@@ -1184,7 +1289,7 @@
         </w:tc>
         <w:tc>
           <w:tcPr>
-            <w:tcW w:type="dxa" w:w="1728"/>
+            <w:tcW w:type="dxa" w:w="1234"/>
           </w:tcPr>
           <w:p>
             <w:r>
@@ -1194,11 +1299,21 @@
         </w:tc>
         <w:tc>
           <w:tcPr>
-            <w:tcW w:type="dxa" w:w="1728"/>
+            <w:tcW w:type="dxa" w:w="1234"/>
           </w:tcPr>
           <w:p>
             <w:r>
-              <w:t>ЗАО КАНОНФАРМА ПРОДАКШН</w:t>
+              <w:t>12.38%</w:t>
+            </w:r>
+          </w:p>
+        </w:tc>
+        <w:tc>
+          <w:tcPr>
+            <w:tcW w:type="dxa" w:w="1234"/>
+          </w:tcPr>
+          <w:p>
+            <w:r>
+              <w:t>ОАО НПК ЭСКОМ</w:t>
             </w:r>
           </w:p>
         </w:tc>
@@ -1206,37 +1321,57 @@
       <w:tr>
         <w:tc>
           <w:tcPr>
-            <w:tcW w:type="dxa" w:w="1728"/>
+            <w:tcW w:type="dxa" w:w="1234"/>
           </w:tcPr>
           <w:p>
             <w:r>
-              <w:t>СчетУчетаНДСПоРеализации</w:t>
+              <w:t>Нет</w:t>
             </w:r>
           </w:p>
         </w:tc>
         <w:tc>
           <w:tcPr>
-            <w:tcW w:type="dxa" w:w="1728"/>
+            <w:tcW w:type="dxa" w:w="1234"/>
           </w:tcPr>
           <w:p>
             <w:r>
-              <w:t>0</w:t>
+              <w:t>-</w:t>
             </w:r>
           </w:p>
         </w:tc>
         <w:tc>
           <w:tcPr>
-            <w:tcW w:type="dxa" w:w="1728"/>
+            <w:tcW w:type="dxa" w:w="1234"/>
           </w:tcPr>
           <w:p>
             <w:r>
-              <w:t>33630</w:t>
+              <w:t>33508</w:t>
             </w:r>
           </w:p>
         </w:tc>
         <w:tc>
           <w:tcPr>
-            <w:tcW w:type="dxa" w:w="1728"/>
+            <w:tcW w:type="dxa" w:w="1234"/>
+          </w:tcPr>
+          <w:p>
+            <w:r>
+              <w:t>117</w:t>
+            </w:r>
+          </w:p>
+        </w:tc>
+        <w:tc>
+          <w:tcPr>
+            <w:tcW w:type="dxa" w:w="1234"/>
+          </w:tcPr>
+          <w:p>
+            <w:r>
+              <w:t>99.65%</w:t>
+            </w:r>
+          </w:p>
+        </w:tc>
+        <w:tc>
+          <w:tcPr>
+            <w:tcW w:type="dxa" w:w="1234"/>
           </w:tcPr>
           <w:p>
             <w:r>
@@ -1246,109 +1381,7 @@
         </w:tc>
         <w:tc>
           <w:tcPr>
-            <w:tcW w:type="dxa" w:w="1728"/>
-          </w:tcPr>
-          <w:p>
-            <w:r/>
-          </w:p>
-        </w:tc>
-      </w:tr>
-      <w:tr>
-        <w:tc>
-          <w:tcPr>
-            <w:tcW w:type="dxa" w:w="1728"/>
-          </w:tcPr>
-          <w:p>
-            <w:r>
-              <w:t>КратностьПоставок</w:t>
-            </w:r>
-          </w:p>
-        </w:tc>
-        <w:tc>
-          <w:tcPr>
-            <w:tcW w:type="dxa" w:w="1728"/>
-          </w:tcPr>
-          <w:p>
-            <w:r>
-              <w:t>1</w:t>
-            </w:r>
-          </w:p>
-        </w:tc>
-        <w:tc>
-          <w:tcPr>
-            <w:tcW w:type="dxa" w:w="1728"/>
-          </w:tcPr>
-          <w:p>
-            <w:r>
-              <w:t>33629</w:t>
-            </w:r>
-          </w:p>
-        </w:tc>
-        <w:tc>
-          <w:tcPr>
-            <w:tcW w:type="dxa" w:w="1728"/>
-          </w:tcPr>
-          <w:p>
-            <w:r>
-              <w:t>0.0%</w:t>
-            </w:r>
-          </w:p>
-        </w:tc>
-        <w:tc>
-          <w:tcPr>
-            <w:tcW w:type="dxa" w:w="1728"/>
-          </w:tcPr>
-          <w:p>
-            <w:r>
-              <w:t>1.0</w:t>
-            </w:r>
-          </w:p>
-        </w:tc>
-      </w:tr>
-      <w:tr>
-        <w:tc>
-          <w:tcPr>
-            <w:tcW w:type="dxa" w:w="1728"/>
-          </w:tcPr>
-          <w:p>
-            <w:r>
-              <w:t>СнятаСПроизводства</w:t>
-            </w:r>
-          </w:p>
-        </w:tc>
-        <w:tc>
-          <w:tcPr>
-            <w:tcW w:type="dxa" w:w="1728"/>
-          </w:tcPr>
-          <w:p>
-            <w:r>
-              <w:t>33513</w:t>
-            </w:r>
-          </w:p>
-        </w:tc>
-        <w:tc>
-          <w:tcPr>
-            <w:tcW w:type="dxa" w:w="1728"/>
-          </w:tcPr>
-          <w:p>
-            <w:r>
-              <w:t>117</w:t>
-            </w:r>
-          </w:p>
-        </w:tc>
-        <w:tc>
-          <w:tcPr>
-            <w:tcW w:type="dxa" w:w="1728"/>
-          </w:tcPr>
-          <w:p>
-            <w:r>
-              <w:t>99.65%</w:t>
-            </w:r>
-          </w:p>
-        </w:tc>
-        <w:tc>
-          <w:tcPr>
-            <w:tcW w:type="dxa" w:w="1728"/>
+            <w:tcW w:type="dxa" w:w="1234"/>
           </w:tcPr>
           <w:p>
             <w:r>
@@ -1360,27 +1393,37 @@
       <w:tr>
         <w:tc>
           <w:tcPr>
-            <w:tcW w:type="dxa" w:w="1728"/>
+            <w:tcW w:type="dxa" w:w="1234"/>
           </w:tcPr>
           <w:p>
             <w:r>
-              <w:t>ЗапретПродажи</w:t>
+              <w:t>Нет.1</w:t>
             </w:r>
           </w:p>
         </w:tc>
         <w:tc>
           <w:tcPr>
-            <w:tcW w:type="dxa" w:w="1728"/>
+            <w:tcW w:type="dxa" w:w="1234"/>
           </w:tcPr>
           <w:p>
             <w:r>
-              <w:t>33513</w:t>
+              <w:t>-</w:t>
             </w:r>
           </w:p>
         </w:tc>
         <w:tc>
           <w:tcPr>
-            <w:tcW w:type="dxa" w:w="1728"/>
+            <w:tcW w:type="dxa" w:w="1234"/>
+          </w:tcPr>
+          <w:p>
+            <w:r>
+              <w:t>33508</w:t>
+            </w:r>
+          </w:p>
+        </w:tc>
+        <w:tc>
+          <w:tcPr>
+            <w:tcW w:type="dxa" w:w="1234"/>
           </w:tcPr>
           <w:p>
             <w:r>
@@ -1390,7 +1433,7 @@
         </w:tc>
         <w:tc>
           <w:tcPr>
-            <w:tcW w:type="dxa" w:w="1728"/>
+            <w:tcW w:type="dxa" w:w="1234"/>
           </w:tcPr>
           <w:p>
             <w:r>
@@ -1400,7 +1443,17 @@
         </w:tc>
         <w:tc>
           <w:tcPr>
-            <w:tcW w:type="dxa" w:w="1728"/>
+            <w:tcW w:type="dxa" w:w="1234"/>
+          </w:tcPr>
+          <w:p>
+            <w:r>
+              <w:t>0.0%</w:t>
+            </w:r>
+          </w:p>
+        </w:tc>
+        <w:tc>
+          <w:tcPr>
+            <w:tcW w:type="dxa" w:w="1234"/>
           </w:tcPr>
           <w:p>
             <w:r>
@@ -1412,27 +1465,37 @@
       <w:tr>
         <w:tc>
           <w:tcPr>
-            <w:tcW w:type="dxa" w:w="1728"/>
+            <w:tcW w:type="dxa" w:w="1234"/>
           </w:tcPr>
           <w:p>
             <w:r>
-              <w:t>ЗапретЗакупки</w:t>
+              <w:t>Нет.2</w:t>
             </w:r>
           </w:p>
         </w:tc>
         <w:tc>
           <w:tcPr>
-            <w:tcW w:type="dxa" w:w="1728"/>
+            <w:tcW w:type="dxa" w:w="1234"/>
           </w:tcPr>
           <w:p>
             <w:r>
-              <w:t>33513</w:t>
+              <w:t>-</w:t>
             </w:r>
           </w:p>
         </w:tc>
         <w:tc>
           <w:tcPr>
-            <w:tcW w:type="dxa" w:w="1728"/>
+            <w:tcW w:type="dxa" w:w="1234"/>
+          </w:tcPr>
+          <w:p>
+            <w:r>
+              <w:t>33508</w:t>
+            </w:r>
+          </w:p>
+        </w:tc>
+        <w:tc>
+          <w:tcPr>
+            <w:tcW w:type="dxa" w:w="1234"/>
           </w:tcPr>
           <w:p>
             <w:r>
@@ -1442,7 +1505,7 @@
         </w:tc>
         <w:tc>
           <w:tcPr>
-            <w:tcW w:type="dxa" w:w="1728"/>
+            <w:tcW w:type="dxa" w:w="1234"/>
           </w:tcPr>
           <w:p>
             <w:r>
@@ -1452,7 +1515,17 @@
         </w:tc>
         <w:tc>
           <w:tcPr>
-            <w:tcW w:type="dxa" w:w="1728"/>
+            <w:tcW w:type="dxa" w:w="1234"/>
+          </w:tcPr>
+          <w:p>
+            <w:r>
+              <w:t>0.0%</w:t>
+            </w:r>
+          </w:p>
+        </w:tc>
+        <w:tc>
+          <w:tcPr>
+            <w:tcW w:type="dxa" w:w="1234"/>
           </w:tcPr>
           <w:p>
             <w:r>
@@ -1464,129 +1537,37 @@
       <w:tr>
         <w:tc>
           <w:tcPr>
-            <w:tcW w:type="dxa" w:w="1728"/>
+            <w:tcW w:type="dxa" w:w="1234"/>
           </w:tcPr>
           <w:p>
             <w:r>
-              <w:t>ФайлКартинки</w:t>
+              <w:t>Да</w:t>
             </w:r>
           </w:p>
         </w:tc>
         <w:tc>
           <w:tcPr>
-            <w:tcW w:type="dxa" w:w="1728"/>
+            <w:tcW w:type="dxa" w:w="1234"/>
           </w:tcPr>
           <w:p>
             <w:r>
-              <w:t>69</w:t>
+              <w:t>-</w:t>
             </w:r>
           </w:p>
         </w:tc>
         <w:tc>
           <w:tcPr>
-            <w:tcW w:type="dxa" w:w="1728"/>
+            <w:tcW w:type="dxa" w:w="1234"/>
           </w:tcPr>
           <w:p>
             <w:r>
-              <w:t>33561</w:t>
+              <w:t>33508</w:t>
             </w:r>
           </w:p>
         </w:tc>
         <w:tc>
           <w:tcPr>
-            <w:tcW w:type="dxa" w:w="1728"/>
-          </w:tcPr>
-          <w:p>
-            <w:r>
-              <w:t>0.21%</w:t>
-            </w:r>
-          </w:p>
-        </w:tc>
-        <w:tc>
-          <w:tcPr>
-            <w:tcW w:type="dxa" w:w="1728"/>
-          </w:tcPr>
-          <w:p>
-            <w:r>
-              <w:t>047baebe36b8a3577b275f16376aeb26a</w:t>
-            </w:r>
-          </w:p>
-        </w:tc>
-      </w:tr>
-      <w:tr>
-        <w:tc>
-          <w:tcPr>
-            <w:tcW w:type="dxa" w:w="1728"/>
-          </w:tcPr>
-          <w:p>
-            <w:r>
-              <w:t>КодТНВЭД</w:t>
-            </w:r>
-          </w:p>
-        </w:tc>
-        <w:tc>
-          <w:tcPr>
-            <w:tcW w:type="dxa" w:w="1728"/>
-          </w:tcPr>
-          <w:p>
-            <w:r>
-              <w:t>0</w:t>
-            </w:r>
-          </w:p>
-        </w:tc>
-        <w:tc>
-          <w:tcPr>
-            <w:tcW w:type="dxa" w:w="1728"/>
-          </w:tcPr>
-          <w:p>
-            <w:r>
-              <w:t>33630</w:t>
-            </w:r>
-          </w:p>
-        </w:tc>
-        <w:tc>
-          <w:tcPr>
-            <w:tcW w:type="dxa" w:w="1728"/>
-          </w:tcPr>
-          <w:p>
-            <w:r>
-              <w:t>0.0%</w:t>
-            </w:r>
-          </w:p>
-        </w:tc>
-        <w:tc>
-          <w:tcPr>
-            <w:tcW w:type="dxa" w:w="1728"/>
-          </w:tcPr>
-          <w:p>
-            <w:r/>
-          </w:p>
-        </w:tc>
-      </w:tr>
-      <w:tr>
-        <w:tc>
-          <w:tcPr>
-            <w:tcW w:type="dxa" w:w="1728"/>
-          </w:tcPr>
-          <w:p>
-            <w:r>
-              <w:t>ЖНВЛС</w:t>
-            </w:r>
-          </w:p>
-        </w:tc>
-        <w:tc>
-          <w:tcPr>
-            <w:tcW w:type="dxa" w:w="1728"/>
-          </w:tcPr>
-          <w:p>
-            <w:r>
-              <w:t>33513</w:t>
-            </w:r>
-          </w:p>
-        </w:tc>
-        <w:tc>
-          <w:tcPr>
-            <w:tcW w:type="dxa" w:w="1728"/>
+            <w:tcW w:type="dxa" w:w="1234"/>
           </w:tcPr>
           <w:p>
             <w:r>
@@ -1596,7 +1577,7 @@
         </w:tc>
         <w:tc>
           <w:tcPr>
-            <w:tcW w:type="dxa" w:w="1728"/>
+            <w:tcW w:type="dxa" w:w="1234"/>
           </w:tcPr>
           <w:p>
             <w:r>
@@ -1606,7 +1587,17 @@
         </w:tc>
         <w:tc>
           <w:tcPr>
-            <w:tcW w:type="dxa" w:w="1728"/>
+            <w:tcW w:type="dxa" w:w="1234"/>
+          </w:tcPr>
+          <w:p>
+            <w:r>
+              <w:t>0.01%</w:t>
+            </w:r>
+          </w:p>
+        </w:tc>
+        <w:tc>
+          <w:tcPr>
+            <w:tcW w:type="dxa" w:w="1234"/>
           </w:tcPr>
           <w:p>
             <w:r>
@@ -1618,27 +1609,37 @@
       <w:tr>
         <w:tc>
           <w:tcPr>
-            <w:tcW w:type="dxa" w:w="1728"/>
+            <w:tcW w:type="dxa" w:w="1234"/>
           </w:tcPr>
           <w:p>
             <w:r>
-              <w:t>ор_ЗарегистрированВСистемеМониторингаЦен</w:t>
+              <w:t>Нет.3</w:t>
             </w:r>
           </w:p>
         </w:tc>
         <w:tc>
           <w:tcPr>
-            <w:tcW w:type="dxa" w:w="1728"/>
+            <w:tcW w:type="dxa" w:w="1234"/>
           </w:tcPr>
           <w:p>
             <w:r>
-              <w:t>33513</w:t>
+              <w:t>-</w:t>
             </w:r>
           </w:p>
         </w:tc>
         <w:tc>
           <w:tcPr>
-            <w:tcW w:type="dxa" w:w="1728"/>
+            <w:tcW w:type="dxa" w:w="1234"/>
+          </w:tcPr>
+          <w:p>
+            <w:r>
+              <w:t>33508</w:t>
+            </w:r>
+          </w:p>
+        </w:tc>
+        <w:tc>
+          <w:tcPr>
+            <w:tcW w:type="dxa" w:w="1234"/>
           </w:tcPr>
           <w:p>
             <w:r>
@@ -1648,7 +1649,7 @@
         </w:tc>
         <w:tc>
           <w:tcPr>
-            <w:tcW w:type="dxa" w:w="1728"/>
+            <w:tcW w:type="dxa" w:w="1234"/>
           </w:tcPr>
           <w:p>
             <w:r>
@@ -1658,7 +1659,17 @@
         </w:tc>
         <w:tc>
           <w:tcPr>
-            <w:tcW w:type="dxa" w:w="1728"/>
+            <w:tcW w:type="dxa" w:w="1234"/>
+          </w:tcPr>
+          <w:p>
+            <w:r>
+              <w:t>0.01%</w:t>
+            </w:r>
+          </w:p>
+        </w:tc>
+        <w:tc>
+          <w:tcPr>
+            <w:tcW w:type="dxa" w:w="1234"/>
           </w:tcPr>
           <w:p>
             <w:r>
@@ -1670,27 +1681,37 @@
       <w:tr>
         <w:tc>
           <w:tcPr>
-            <w:tcW w:type="dxa" w:w="1728"/>
+            <w:tcW w:type="dxa" w:w="1234"/>
           </w:tcPr>
           <w:p>
             <w:r>
-              <w:t>ор_ОтпускПоРецепту</w:t>
+              <w:t>Да.1</w:t>
             </w:r>
           </w:p>
         </w:tc>
         <w:tc>
           <w:tcPr>
-            <w:tcW w:type="dxa" w:w="1728"/>
+            <w:tcW w:type="dxa" w:w="1234"/>
           </w:tcPr>
           <w:p>
             <w:r>
-              <w:t>33513</w:t>
+              <w:t>-</w:t>
             </w:r>
           </w:p>
         </w:tc>
         <w:tc>
           <w:tcPr>
-            <w:tcW w:type="dxa" w:w="1728"/>
+            <w:tcW w:type="dxa" w:w="1234"/>
+          </w:tcPr>
+          <w:p>
+            <w:r>
+              <w:t>33508</w:t>
+            </w:r>
+          </w:p>
+        </w:tc>
+        <w:tc>
+          <w:tcPr>
+            <w:tcW w:type="dxa" w:w="1234"/>
           </w:tcPr>
           <w:p>
             <w:r>
@@ -1700,7 +1721,7 @@
         </w:tc>
         <w:tc>
           <w:tcPr>
-            <w:tcW w:type="dxa" w:w="1728"/>
+            <w:tcW w:type="dxa" w:w="1234"/>
           </w:tcPr>
           <w:p>
             <w:r>
@@ -1710,7 +1731,17 @@
         </w:tc>
         <w:tc>
           <w:tcPr>
-            <w:tcW w:type="dxa" w:w="1728"/>
+            <w:tcW w:type="dxa" w:w="1234"/>
+          </w:tcPr>
+          <w:p>
+            <w:r>
+              <w:t>0.01%</w:t>
+            </w:r>
+          </w:p>
+        </w:tc>
+        <w:tc>
+          <w:tcPr>
+            <w:tcW w:type="dxa" w:w="1234"/>
           </w:tcPr>
           <w:p>
             <w:r>
@@ -1722,37 +1753,417 @@
       <w:tr>
         <w:tc>
           <w:tcPr>
-            <w:tcW w:type="dxa" w:w="1728"/>
+            <w:tcW w:type="dxa" w:w="1234"/>
           </w:tcPr>
           <w:p>
             <w:r>
-              <w:t>СписокНСиПТВ</w:t>
+              <w:t>Вольтарен</w:t>
             </w:r>
           </w:p>
         </w:tc>
         <w:tc>
           <w:tcPr>
-            <w:tcW w:type="dxa" w:w="1728"/>
+            <w:tcW w:type="dxa" w:w="1234"/>
           </w:tcPr>
           <w:p>
             <w:r>
-              <w:t>1</w:t>
+              <w:t>-</w:t>
             </w:r>
           </w:p>
         </w:tc>
         <w:tc>
           <w:tcPr>
-            <w:tcW w:type="dxa" w:w="1728"/>
+            <w:tcW w:type="dxa" w:w="1234"/>
           </w:tcPr>
           <w:p>
             <w:r>
-              <w:t>33629</w:t>
+              <w:t>11841</w:t>
             </w:r>
           </w:p>
         </w:tc>
         <w:tc>
           <w:tcPr>
-            <w:tcW w:type="dxa" w:w="1728"/>
+            <w:tcW w:type="dxa" w:w="1234"/>
+          </w:tcPr>
+          <w:p>
+            <w:r>
+              <w:t>21784</w:t>
+            </w:r>
+          </w:p>
+        </w:tc>
+        <w:tc>
+          <w:tcPr>
+            <w:tcW w:type="dxa" w:w="1234"/>
+          </w:tcPr>
+          <w:p>
+            <w:r>
+              <w:t>35.21%</w:t>
+            </w:r>
+          </w:p>
+        </w:tc>
+        <w:tc>
+          <w:tcPr>
+            <w:tcW w:type="dxa" w:w="1234"/>
+          </w:tcPr>
+          <w:p>
+            <w:r>
+              <w:t>37.07%</w:t>
+            </w:r>
+          </w:p>
+        </w:tc>
+        <w:tc>
+          <w:tcPr>
+            <w:tcW w:type="dxa" w:w="1234"/>
+          </w:tcPr>
+          <w:p>
+            <w:r>
+              <w:t>Ацесоль</w:t>
+            </w:r>
+          </w:p>
+        </w:tc>
+      </w:tr>
+      <w:tr>
+        <w:tc>
+          <w:tcPr>
+            <w:tcW w:type="dxa" w:w="1234"/>
+          </w:tcPr>
+          <w:p>
+            <w:r>
+              <w:t>ДИКЛОФЕНАК</w:t>
+            </w:r>
+          </w:p>
+        </w:tc>
+        <w:tc>
+          <w:tcPr>
+            <w:tcW w:type="dxa" w:w="1234"/>
+          </w:tcPr>
+          <w:p>
+            <w:r>
+              <w:t>-</w:t>
+            </w:r>
+          </w:p>
+        </w:tc>
+        <w:tc>
+          <w:tcPr>
+            <w:tcW w:type="dxa" w:w="1234"/>
+          </w:tcPr>
+          <w:p>
+            <w:r>
+              <w:t>8277</w:t>
+            </w:r>
+          </w:p>
+        </w:tc>
+        <w:tc>
+          <w:tcPr>
+            <w:tcW w:type="dxa" w:w="1234"/>
+          </w:tcPr>
+          <w:p>
+            <w:r>
+              <w:t>25348</w:t>
+            </w:r>
+          </w:p>
+        </w:tc>
+        <w:tc>
+          <w:tcPr>
+            <w:tcW w:type="dxa" w:w="1234"/>
+          </w:tcPr>
+          <w:p>
+            <w:r>
+              <w:t>24.62%</w:t>
+            </w:r>
+          </w:p>
+        </w:tc>
+        <w:tc>
+          <w:tcPr>
+            <w:tcW w:type="dxa" w:w="1234"/>
+          </w:tcPr>
+          <w:p>
+            <w:r>
+              <w:t>16.9%</w:t>
+            </w:r>
+          </w:p>
+        </w:tc>
+        <w:tc>
+          <w:tcPr>
+            <w:tcW w:type="dxa" w:w="1234"/>
+          </w:tcPr>
+          <w:p>
+            <w:r>
+              <w:t>КАЛИЯ ХЛОРИД+НАТРИЯ АЦЕТАТ+НАТРИЯ ХЛОРИД</w:t>
+            </w:r>
+          </w:p>
+        </w:tc>
+      </w:tr>
+      <w:tr>
+        <w:tc>
+          <w:tcPr>
+            <w:tcW w:type="dxa" w:w="1234"/>
+          </w:tcPr>
+          <w:p>
+            <w:r>
+              <w:t>Таблетки, покрытые оболочкой</w:t>
+            </w:r>
+          </w:p>
+        </w:tc>
+        <w:tc>
+          <w:tcPr>
+            <w:tcW w:type="dxa" w:w="1234"/>
+          </w:tcPr>
+          <w:p>
+            <w:r>
+              <w:t>-</w:t>
+            </w:r>
+          </w:p>
+        </w:tc>
+        <w:tc>
+          <w:tcPr>
+            <w:tcW w:type="dxa" w:w="1234"/>
+          </w:tcPr>
+          <w:p>
+            <w:r>
+              <w:t>8233</w:t>
+            </w:r>
+          </w:p>
+        </w:tc>
+        <w:tc>
+          <w:tcPr>
+            <w:tcW w:type="dxa" w:w="1234"/>
+          </w:tcPr>
+          <w:p>
+            <w:r>
+              <w:t>25392</w:t>
+            </w:r>
+          </w:p>
+        </w:tc>
+        <w:tc>
+          <w:tcPr>
+            <w:tcW w:type="dxa" w:w="1234"/>
+          </w:tcPr>
+          <w:p>
+            <w:r>
+              <w:t>24.48%</w:t>
+            </w:r>
+          </w:p>
+        </w:tc>
+        <w:tc>
+          <w:tcPr>
+            <w:tcW w:type="dxa" w:w="1234"/>
+          </w:tcPr>
+          <w:p>
+            <w:r>
+              <w:t>1.65%</w:t>
+            </w:r>
+          </w:p>
+        </w:tc>
+        <w:tc>
+          <w:tcPr>
+            <w:tcW w:type="dxa" w:w="1234"/>
+          </w:tcPr>
+          <w:p>
+            <w:r>
+              <w:t>Раствор для инфузий</w:t>
+            </w:r>
+          </w:p>
+        </w:tc>
+      </w:tr>
+      <w:tr>
+        <w:tc>
+          <w:tcPr>
+            <w:tcW w:type="dxa" w:w="1234"/>
+          </w:tcPr>
+          <w:p>
+            <w:r>
+              <w:t>Таблетки, покрытые оболочкой, 25 мг</w:t>
+            </w:r>
+          </w:p>
+        </w:tc>
+        <w:tc>
+          <w:tcPr>
+            <w:tcW w:type="dxa" w:w="1234"/>
+          </w:tcPr>
+          <w:p>
+            <w:r>
+              <w:t>-</w:t>
+            </w:r>
+          </w:p>
+        </w:tc>
+        <w:tc>
+          <w:tcPr>
+            <w:tcW w:type="dxa" w:w="1234"/>
+          </w:tcPr>
+          <w:p>
+            <w:r>
+              <w:t>8255</w:t>
+            </w:r>
+          </w:p>
+        </w:tc>
+        <w:tc>
+          <w:tcPr>
+            <w:tcW w:type="dxa" w:w="1234"/>
+          </w:tcPr>
+          <w:p>
+            <w:r>
+              <w:t>25370</w:t>
+            </w:r>
+          </w:p>
+        </w:tc>
+        <w:tc>
+          <w:tcPr>
+            <w:tcW w:type="dxa" w:w="1234"/>
+          </w:tcPr>
+          <w:p>
+            <w:r>
+              <w:t>24.55%</w:t>
+            </w:r>
+          </w:p>
+        </w:tc>
+        <w:tc>
+          <w:tcPr>
+            <w:tcW w:type="dxa" w:w="1234"/>
+          </w:tcPr>
+          <w:p>
+            <w:r>
+              <w:t>17.94%</w:t>
+            </w:r>
+          </w:p>
+        </w:tc>
+        <w:tc>
+          <w:tcPr>
+            <w:tcW w:type="dxa" w:w="1234"/>
+          </w:tcPr>
+          <w:p>
+            <w:r>
+              <w:t>Раствор для инфузий, 1 1 мг+2 мг+5 мг/мл</w:t>
+            </w:r>
+          </w:p>
+        </w:tc>
+      </w:tr>
+      <w:tr>
+        <w:tc>
+          <w:tcPr>
+            <w:tcW w:type="dxa" w:w="1234"/>
+          </w:tcPr>
+          <w:p>
+            <w:r>
+              <w:t>НОВАРТИС ФАРМА АГ</w:t>
+            </w:r>
+          </w:p>
+        </w:tc>
+        <w:tc>
+          <w:tcPr>
+            <w:tcW w:type="dxa" w:w="1234"/>
+          </w:tcPr>
+          <w:p>
+            <w:r>
+              <w:t>-</w:t>
+            </w:r>
+          </w:p>
+        </w:tc>
+        <w:tc>
+          <w:tcPr>
+            <w:tcW w:type="dxa" w:w="1234"/>
+          </w:tcPr>
+          <w:p>
+            <w:r>
+              <w:t>10699</w:t>
+            </w:r>
+          </w:p>
+        </w:tc>
+        <w:tc>
+          <w:tcPr>
+            <w:tcW w:type="dxa" w:w="1234"/>
+          </w:tcPr>
+          <w:p>
+            <w:r>
+              <w:t>22926</w:t>
+            </w:r>
+          </w:p>
+        </w:tc>
+        <w:tc>
+          <w:tcPr>
+            <w:tcW w:type="dxa" w:w="1234"/>
+          </w:tcPr>
+          <w:p>
+            <w:r>
+              <w:t>31.82%</w:t>
+            </w:r>
+          </w:p>
+        </w:tc>
+        <w:tc>
+          <w:tcPr>
+            <w:tcW w:type="dxa" w:w="1234"/>
+          </w:tcPr>
+          <w:p>
+            <w:r>
+              <w:t>6.95%</w:t>
+            </w:r>
+          </w:p>
+        </w:tc>
+        <w:tc>
+          <w:tcPr>
+            <w:tcW w:type="dxa" w:w="1234"/>
+          </w:tcPr>
+          <w:p>
+            <w:r>
+              <w:t>ООО ХФК МИР</w:t>
+            </w:r>
+          </w:p>
+        </w:tc>
+      </w:tr>
+      <w:tr>
+        <w:tc>
+          <w:tcPr>
+            <w:tcW w:type="dxa" w:w="1234"/>
+          </w:tcPr>
+          <w:p>
+            <w:r>
+              <w:t>Нет.4</w:t>
+            </w:r>
+          </w:p>
+        </w:tc>
+        <w:tc>
+          <w:tcPr>
+            <w:tcW w:type="dxa" w:w="1234"/>
+          </w:tcPr>
+          <w:p>
+            <w:r>
+              <w:t>-</w:t>
+            </w:r>
+          </w:p>
+        </w:tc>
+        <w:tc>
+          <w:tcPr>
+            <w:tcW w:type="dxa" w:w="1234"/>
+          </w:tcPr>
+          <w:p>
+            <w:r>
+              <w:t>33508</w:t>
+            </w:r>
+          </w:p>
+        </w:tc>
+        <w:tc>
+          <w:tcPr>
+            <w:tcW w:type="dxa" w:w="1234"/>
+          </w:tcPr>
+          <w:p>
+            <w:r>
+              <w:t>117</w:t>
+            </w:r>
+          </w:p>
+        </w:tc>
+        <w:tc>
+          <w:tcPr>
+            <w:tcW w:type="dxa" w:w="1234"/>
+          </w:tcPr>
+          <w:p>
+            <w:r>
+              <w:t>99.65%</w:t>
+            </w:r>
+          </w:p>
+        </w:tc>
+        <w:tc>
+          <w:tcPr>
+            <w:tcW w:type="dxa" w:w="1234"/>
           </w:tcPr>
           <w:p>
             <w:r>
@@ -1762,629 +2173,7 @@
         </w:tc>
         <w:tc>
           <w:tcPr>
-            <w:tcW w:type="dxa" w:w="1728"/>
-          </w:tcPr>
-          <w:p>
-            <w:r>
-              <w:t>Список IV Прекурсоры</w:t>
-            </w:r>
-          </w:p>
-        </w:tc>
-      </w:tr>
-      <w:tr>
-        <w:tc>
-          <w:tcPr>
-            <w:tcW w:type="dxa" w:w="1728"/>
-          </w:tcPr>
-          <w:p>
-            <w:r>
-              <w:t>СписокСильнодействующиеИЯды1</w:t>
-            </w:r>
-          </w:p>
-        </w:tc>
-        <w:tc>
-          <w:tcPr>
-            <w:tcW w:type="dxa" w:w="1728"/>
-          </w:tcPr>
-          <w:p>
-            <w:r>
-              <w:t>1</w:t>
-            </w:r>
-          </w:p>
-        </w:tc>
-        <w:tc>
-          <w:tcPr>
-            <w:tcW w:type="dxa" w:w="1728"/>
-          </w:tcPr>
-          <w:p>
-            <w:r>
-              <w:t>33629</w:t>
-            </w:r>
-          </w:p>
-        </w:tc>
-        <w:tc>
-          <w:tcPr>
-            <w:tcW w:type="dxa" w:w="1728"/>
-          </w:tcPr>
-          <w:p>
-            <w:r>
-              <w:t>0.0%</w:t>
-            </w:r>
-          </w:p>
-        </w:tc>
-        <w:tc>
-          <w:tcPr>
-            <w:tcW w:type="dxa" w:w="1728"/>
-          </w:tcPr>
-          <w:p>
-            <w:r>
-              <w:t>Сильнодействующее</w:t>
-            </w:r>
-          </w:p>
-        </w:tc>
-      </w:tr>
-      <w:tr>
-        <w:tc>
-          <w:tcPr>
-            <w:tcW w:type="dxa" w:w="1728"/>
-          </w:tcPr>
-          <w:p>
-            <w:r>
-              <w:t>ор_КодРосздравнадзора</w:t>
-            </w:r>
-          </w:p>
-        </w:tc>
-        <w:tc>
-          <w:tcPr>
-            <w:tcW w:type="dxa" w:w="1728"/>
-          </w:tcPr>
-          <w:p>
-            <w:r>
-              <w:t>1</w:t>
-            </w:r>
-          </w:p>
-        </w:tc>
-        <w:tc>
-          <w:tcPr>
-            <w:tcW w:type="dxa" w:w="1728"/>
-          </w:tcPr>
-          <w:p>
-            <w:r>
-              <w:t>33629</w:t>
-            </w:r>
-          </w:p>
-        </w:tc>
-        <w:tc>
-          <w:tcPr>
-            <w:tcW w:type="dxa" w:w="1728"/>
-          </w:tcPr>
-          <w:p>
-            <w:r>
-              <w:t>0.0%</w:t>
-            </w:r>
-          </w:p>
-        </w:tc>
-        <w:tc>
-          <w:tcPr>
-            <w:tcW w:type="dxa" w:w="1728"/>
-          </w:tcPr>
-          <w:p>
-            <w:r>
-              <w:t>1.0</w:t>
-            </w:r>
-          </w:p>
-        </w:tc>
-      </w:tr>
-      <w:tr>
-        <w:tc>
-          <w:tcPr>
-            <w:tcW w:type="dxa" w:w="1728"/>
-          </w:tcPr>
-          <w:p>
-            <w:r>
-              <w:t>ТорговоеНаименование</w:t>
-            </w:r>
-          </w:p>
-        </w:tc>
-        <w:tc>
-          <w:tcPr>
-            <w:tcW w:type="dxa" w:w="1728"/>
-          </w:tcPr>
-          <w:p>
-            <w:r>
-              <w:t>11846</w:t>
-            </w:r>
-          </w:p>
-        </w:tc>
-        <w:tc>
-          <w:tcPr>
-            <w:tcW w:type="dxa" w:w="1728"/>
-          </w:tcPr>
-          <w:p>
-            <w:r>
-              <w:t>21784</w:t>
-            </w:r>
-          </w:p>
-        </w:tc>
-        <w:tc>
-          <w:tcPr>
-            <w:tcW w:type="dxa" w:w="1728"/>
-          </w:tcPr>
-          <w:p>
-            <w:r>
-              <w:t>35.22%</w:t>
-            </w:r>
-          </w:p>
-        </w:tc>
-        <w:tc>
-          <w:tcPr>
-            <w:tcW w:type="dxa" w:w="1728"/>
-          </w:tcPr>
-          <w:p>
-            <w:r>
-              <w:t>Солифенацин Канон</w:t>
-            </w:r>
-          </w:p>
-        </w:tc>
-      </w:tr>
-      <w:tr>
-        <w:tc>
-          <w:tcPr>
-            <w:tcW w:type="dxa" w:w="1728"/>
-          </w:tcPr>
-          <w:p>
-            <w:r>
-              <w:t>МНН</w:t>
-            </w:r>
-          </w:p>
-        </w:tc>
-        <w:tc>
-          <w:tcPr>
-            <w:tcW w:type="dxa" w:w="1728"/>
-          </w:tcPr>
-          <w:p>
-            <w:r>
-              <w:t>8282</w:t>
-            </w:r>
-          </w:p>
-        </w:tc>
-        <w:tc>
-          <w:tcPr>
-            <w:tcW w:type="dxa" w:w="1728"/>
-          </w:tcPr>
-          <w:p>
-            <w:r>
-              <w:t>25348</w:t>
-            </w:r>
-          </w:p>
-        </w:tc>
-        <w:tc>
-          <w:tcPr>
-            <w:tcW w:type="dxa" w:w="1728"/>
-          </w:tcPr>
-          <w:p>
-            <w:r>
-              <w:t>24.63%</w:t>
-            </w:r>
-          </w:p>
-        </w:tc>
-        <w:tc>
-          <w:tcPr>
-            <w:tcW w:type="dxa" w:w="1728"/>
-          </w:tcPr>
-          <w:p>
-            <w:r>
-              <w:t>СОЛИФЕНАЦИН</w:t>
-            </w:r>
-          </w:p>
-        </w:tc>
-      </w:tr>
-      <w:tr>
-        <w:tc>
-          <w:tcPr>
-            <w:tcW w:type="dxa" w:w="1728"/>
-          </w:tcPr>
-          <w:p>
-            <w:r>
-              <w:t>УдалитьАТХКлассификация</w:t>
-            </w:r>
-          </w:p>
-        </w:tc>
-        <w:tc>
-          <w:tcPr>
-            <w:tcW w:type="dxa" w:w="1728"/>
-          </w:tcPr>
-          <w:p>
-            <w:r>
-              <w:t>0</w:t>
-            </w:r>
-          </w:p>
-        </w:tc>
-        <w:tc>
-          <w:tcPr>
-            <w:tcW w:type="dxa" w:w="1728"/>
-          </w:tcPr>
-          <w:p>
-            <w:r>
-              <w:t>33630</w:t>
-            </w:r>
-          </w:p>
-        </w:tc>
-        <w:tc>
-          <w:tcPr>
-            <w:tcW w:type="dxa" w:w="1728"/>
-          </w:tcPr>
-          <w:p>
-            <w:r>
-              <w:t>0.0%</w:t>
-            </w:r>
-          </w:p>
-        </w:tc>
-        <w:tc>
-          <w:tcPr>
-            <w:tcW w:type="dxa" w:w="1728"/>
-          </w:tcPr>
-          <w:p>
-            <w:r/>
-          </w:p>
-        </w:tc>
-      </w:tr>
-      <w:tr>
-        <w:tc>
-          <w:tcPr>
-            <w:tcW w:type="dxa" w:w="1728"/>
-          </w:tcPr>
-          <w:p>
-            <w:r>
-              <w:t>ФармакологическоеДействие</w:t>
-            </w:r>
-          </w:p>
-        </w:tc>
-        <w:tc>
-          <w:tcPr>
-            <w:tcW w:type="dxa" w:w="1728"/>
-          </w:tcPr>
-          <w:p>
-            <w:r>
-              <w:t>1</w:t>
-            </w:r>
-          </w:p>
-        </w:tc>
-        <w:tc>
-          <w:tcPr>
-            <w:tcW w:type="dxa" w:w="1728"/>
-          </w:tcPr>
-          <w:p>
-            <w:r>
-              <w:t>33629</w:t>
-            </w:r>
-          </w:p>
-        </w:tc>
-        <w:tc>
-          <w:tcPr>
-            <w:tcW w:type="dxa" w:w="1728"/>
-          </w:tcPr>
-          <w:p>
-            <w:r>
-              <w:t>0.0%</w:t>
-            </w:r>
-          </w:p>
-        </w:tc>
-        <w:tc>
-          <w:tcPr>
-            <w:tcW w:type="dxa" w:w="1728"/>
-          </w:tcPr>
-          <w:p>
-            <w:r>
-              <w:t>от кашля</w:t>
-            </w:r>
-          </w:p>
-        </w:tc>
-      </w:tr>
-      <w:tr>
-        <w:tc>
-          <w:tcPr>
-            <w:tcW w:type="dxa" w:w="1728"/>
-          </w:tcPr>
-          <w:p>
-            <w:r>
-              <w:t>ЛекарственныеФормы</w:t>
-            </w:r>
-          </w:p>
-        </w:tc>
-        <w:tc>
-          <w:tcPr>
-            <w:tcW w:type="dxa" w:w="1728"/>
-          </w:tcPr>
-          <w:p>
-            <w:r>
-              <w:t>8238</w:t>
-            </w:r>
-          </w:p>
-        </w:tc>
-        <w:tc>
-          <w:tcPr>
-            <w:tcW w:type="dxa" w:w="1728"/>
-          </w:tcPr>
-          <w:p>
-            <w:r>
-              <w:t>25392</w:t>
-            </w:r>
-          </w:p>
-        </w:tc>
-        <w:tc>
-          <w:tcPr>
-            <w:tcW w:type="dxa" w:w="1728"/>
-          </w:tcPr>
-          <w:p>
-            <w:r>
-              <w:t>24.5%</w:t>
-            </w:r>
-          </w:p>
-        </w:tc>
-        <w:tc>
-          <w:tcPr>
-            <w:tcW w:type="dxa" w:w="1728"/>
-          </w:tcPr>
-          <w:p>
-            <w:r>
-              <w:t>Таблетки, покрытые оболочкой</w:t>
-            </w:r>
-          </w:p>
-        </w:tc>
-      </w:tr>
-      <w:tr>
-        <w:tc>
-          <w:tcPr>
-            <w:tcW w:type="dxa" w:w="1728"/>
-          </w:tcPr>
-          <w:p>
-            <w:r>
-              <w:t>ФормыВыпуска</w:t>
-            </w:r>
-          </w:p>
-        </w:tc>
-        <w:tc>
-          <w:tcPr>
-            <w:tcW w:type="dxa" w:w="1728"/>
-          </w:tcPr>
-          <w:p>
-            <w:r>
-              <w:t>8260</w:t>
-            </w:r>
-          </w:p>
-        </w:tc>
-        <w:tc>
-          <w:tcPr>
-            <w:tcW w:type="dxa" w:w="1728"/>
-          </w:tcPr>
-          <w:p>
-            <w:r>
-              <w:t>25370</w:t>
-            </w:r>
-          </w:p>
-        </w:tc>
-        <w:tc>
-          <w:tcPr>
-            <w:tcW w:type="dxa" w:w="1728"/>
-          </w:tcPr>
-          <w:p>
-            <w:r>
-              <w:t>24.56%</w:t>
-            </w:r>
-          </w:p>
-        </w:tc>
-        <w:tc>
-          <w:tcPr>
-            <w:tcW w:type="dxa" w:w="1728"/>
-          </w:tcPr>
-          <w:p>
-            <w:r>
-              <w:t>Таблетки, покрытые оболочкой, 10 мг</w:t>
-            </w:r>
-          </w:p>
-        </w:tc>
-      </w:tr>
-      <w:tr>
-        <w:tc>
-          <w:tcPr>
-            <w:tcW w:type="dxa" w:w="1728"/>
-          </w:tcPr>
-          <w:p>
-            <w:r>
-              <w:t>ФирмаРегистратор</w:t>
-            </w:r>
-          </w:p>
-        </w:tc>
-        <w:tc>
-          <w:tcPr>
-            <w:tcW w:type="dxa" w:w="1728"/>
-          </w:tcPr>
-          <w:p>
-            <w:r>
-              <w:t>10704</w:t>
-            </w:r>
-          </w:p>
-        </w:tc>
-        <w:tc>
-          <w:tcPr>
-            <w:tcW w:type="dxa" w:w="1728"/>
-          </w:tcPr>
-          <w:p>
-            <w:r>
-              <w:t>22926</w:t>
-            </w:r>
-          </w:p>
-        </w:tc>
-        <w:tc>
-          <w:tcPr>
-            <w:tcW w:type="dxa" w:w="1728"/>
-          </w:tcPr>
-          <w:p>
-            <w:r>
-              <w:t>31.83%</w:t>
-            </w:r>
-          </w:p>
-        </w:tc>
-        <w:tc>
-          <w:tcPr>
-            <w:tcW w:type="dxa" w:w="1728"/>
-          </w:tcPr>
-          <w:p>
-            <w:r>
-              <w:t>ЗАО КАНОНФАРМА ПРОДАКШН</w:t>
-            </w:r>
-          </w:p>
-        </w:tc>
-      </w:tr>
-      <w:tr>
-        <w:tc>
-          <w:tcPr>
-            <w:tcW w:type="dxa" w:w="1728"/>
-          </w:tcPr>
-          <w:p>
-            <w:r>
-              <w:t>ФирмаУпаковщик</w:t>
-            </w:r>
-          </w:p>
-        </w:tc>
-        <w:tc>
-          <w:tcPr>
-            <w:tcW w:type="dxa" w:w="1728"/>
-          </w:tcPr>
-          <w:p>
-            <w:r>
-              <w:t>11</w:t>
-            </w:r>
-          </w:p>
-        </w:tc>
-        <w:tc>
-          <w:tcPr>
-            <w:tcW w:type="dxa" w:w="1728"/>
-          </w:tcPr>
-          <w:p>
-            <w:r>
-              <w:t>33619</w:t>
-            </w:r>
-          </w:p>
-        </w:tc>
-        <w:tc>
-          <w:tcPr>
-            <w:tcW w:type="dxa" w:w="1728"/>
-          </w:tcPr>
-          <w:p>
-            <w:r>
-              <w:t>0.03%</w:t>
-            </w:r>
-          </w:p>
-        </w:tc>
-        <w:tc>
-          <w:tcPr>
-            <w:tcW w:type="dxa" w:w="1728"/>
-          </w:tcPr>
-          <w:p>
-            <w:r>
-              <w:t>ООО ГРОТЕКС</w:t>
-            </w:r>
-          </w:p>
-        </w:tc>
-      </w:tr>
-      <w:tr>
-        <w:tc>
-          <w:tcPr>
-            <w:tcW w:type="dxa" w:w="1728"/>
-          </w:tcPr>
-          <w:p>
-            <w:r>
-              <w:t>МинимальнаяЕдиницаОтпуска</w:t>
-            </w:r>
-          </w:p>
-        </w:tc>
-        <w:tc>
-          <w:tcPr>
-            <w:tcW w:type="dxa" w:w="1728"/>
-          </w:tcPr>
-          <w:p>
-            <w:r>
-              <w:t>55</w:t>
-            </w:r>
-          </w:p>
-        </w:tc>
-        <w:tc>
-          <w:tcPr>
-            <w:tcW w:type="dxa" w:w="1728"/>
-          </w:tcPr>
-          <w:p>
-            <w:r>
-              <w:t>33575</w:t>
-            </w:r>
-          </w:p>
-        </w:tc>
-        <w:tc>
-          <w:tcPr>
-            <w:tcW w:type="dxa" w:w="1728"/>
-          </w:tcPr>
-          <w:p>
-            <w:r>
-              <w:t>0.16%</w:t>
-            </w:r>
-          </w:p>
-        </w:tc>
-        <w:tc>
-          <w:tcPr>
-            <w:tcW w:type="dxa" w:w="1728"/>
-          </w:tcPr>
-          <w:p>
-            <w:r>
-              <w:t>блистер</w:t>
-            </w:r>
-          </w:p>
-        </w:tc>
-      </w:tr>
-      <w:tr>
-        <w:tc>
-          <w:tcPr>
-            <w:tcW w:type="dxa" w:w="1728"/>
-          </w:tcPr>
-          <w:p>
-            <w:r>
-              <w:t>СинхронизацияИзКлассификатора</w:t>
-            </w:r>
-          </w:p>
-        </w:tc>
-        <w:tc>
-          <w:tcPr>
-            <w:tcW w:type="dxa" w:w="1728"/>
-          </w:tcPr>
-          <w:p>
-            <w:r>
-              <w:t>33513</w:t>
-            </w:r>
-          </w:p>
-        </w:tc>
-        <w:tc>
-          <w:tcPr>
-            <w:tcW w:type="dxa" w:w="1728"/>
-          </w:tcPr>
-          <w:p>
-            <w:r>
-              <w:t>117</w:t>
-            </w:r>
-          </w:p>
-        </w:tc>
-        <w:tc>
-          <w:tcPr>
-            <w:tcW w:type="dxa" w:w="1728"/>
-          </w:tcPr>
-          <w:p>
-            <w:r>
-              <w:t>99.65%</w:t>
-            </w:r>
-          </w:p>
-        </w:tc>
-        <w:tc>
-          <w:tcPr>
-            <w:tcW w:type="dxa" w:w="1728"/>
+            <w:tcW w:type="dxa" w:w="1234"/>
           </w:tcPr>
           <w:p>
             <w:r>
@@ -2396,541 +2185,37 @@
       <w:tr>
         <w:tc>
           <w:tcPr>
-            <w:tcW w:type="dxa" w:w="1728"/>
+            <w:tcW w:type="dxa" w:w="1234"/>
           </w:tcPr>
           <w:p>
             <w:r>
-              <w:t>ТоварыФармацевтическогоРынка</w:t>
+              <w:t>Единый справочник–каталог лекарственных препаратов</w:t>
             </w:r>
           </w:p>
         </w:tc>
         <w:tc>
           <w:tcPr>
-            <w:tcW w:type="dxa" w:w="1728"/>
+            <w:tcW w:type="dxa" w:w="1234"/>
           </w:tcPr>
           <w:p>
             <w:r>
-              <w:t>75</w:t>
+              <w:t>-</w:t>
             </w:r>
           </w:p>
         </w:tc>
         <w:tc>
           <w:tcPr>
-            <w:tcW w:type="dxa" w:w="1728"/>
+            <w:tcW w:type="dxa" w:w="1234"/>
           </w:tcPr>
           <w:p>
             <w:r>
-              <w:t>33555</w:t>
+              <w:t>33505</w:t>
             </w:r>
           </w:p>
         </w:tc>
         <w:tc>
           <w:tcPr>
-            <w:tcW w:type="dxa" w:w="1728"/>
-          </w:tcPr>
-          <w:p>
-            <w:r>
-              <w:t>0.22%</w:t>
-            </w:r>
-          </w:p>
-        </w:tc>
-        <w:tc>
-          <w:tcPr>
-            <w:tcW w:type="dxa" w:w="1728"/>
-          </w:tcPr>
-          <w:p>
-            <w:r>
-              <w:t>Лекарственное средство</w:t>
-            </w:r>
-          </w:p>
-        </w:tc>
-      </w:tr>
-      <w:tr>
-        <w:tc>
-          <w:tcPr>
-            <w:tcW w:type="dxa" w:w="1728"/>
-          </w:tcPr>
-          <w:p>
-            <w:r>
-              <w:t>ПредельноеОтклонениеОтЦены</w:t>
-            </w:r>
-          </w:p>
-        </w:tc>
-        <w:tc>
-          <w:tcPr>
-            <w:tcW w:type="dxa" w:w="1728"/>
-          </w:tcPr>
-          <w:p>
-            <w:r>
-              <w:t>0</w:t>
-            </w:r>
-          </w:p>
-        </w:tc>
-        <w:tc>
-          <w:tcPr>
-            <w:tcW w:type="dxa" w:w="1728"/>
-          </w:tcPr>
-          <w:p>
-            <w:r>
-              <w:t>33630</w:t>
-            </w:r>
-          </w:p>
-        </w:tc>
-        <w:tc>
-          <w:tcPr>
-            <w:tcW w:type="dxa" w:w="1728"/>
-          </w:tcPr>
-          <w:p>
-            <w:r>
-              <w:t>0.0%</w:t>
-            </w:r>
-          </w:p>
-        </w:tc>
-        <w:tc>
-          <w:tcPr>
-            <w:tcW w:type="dxa" w:w="1728"/>
-          </w:tcPr>
-          <w:p>
-            <w:r/>
-          </w:p>
-        </w:tc>
-      </w:tr>
-      <w:tr>
-        <w:tc>
-          <w:tcPr>
-            <w:tcW w:type="dxa" w:w="1728"/>
-          </w:tcPr>
-          <w:p>
-            <w:r>
-              <w:t>ГруппаАналоговРеализации</w:t>
-            </w:r>
-          </w:p>
-        </w:tc>
-        <w:tc>
-          <w:tcPr>
-            <w:tcW w:type="dxa" w:w="1728"/>
-          </w:tcPr>
-          <w:p>
-            <w:r>
-              <w:t>3</w:t>
-            </w:r>
-          </w:p>
-        </w:tc>
-        <w:tc>
-          <w:tcPr>
-            <w:tcW w:type="dxa" w:w="1728"/>
-          </w:tcPr>
-          <w:p>
-            <w:r>
-              <w:t>33627</w:t>
-            </w:r>
-          </w:p>
-        </w:tc>
-        <w:tc>
-          <w:tcPr>
-            <w:tcW w:type="dxa" w:w="1728"/>
-          </w:tcPr>
-          <w:p>
-            <w:r>
-              <w:t>0.01%</w:t>
-            </w:r>
-          </w:p>
-        </w:tc>
-        <w:tc>
-          <w:tcPr>
-            <w:tcW w:type="dxa" w:w="1728"/>
-          </w:tcPr>
-          <w:p>
-            <w:r>
-              <w:t>Аналоги</w:t>
-            </w:r>
-          </w:p>
-        </w:tc>
-      </w:tr>
-      <w:tr>
-        <w:tc>
-          <w:tcPr>
-            <w:tcW w:type="dxa" w:w="1728"/>
-          </w:tcPr>
-          <w:p>
-            <w:r>
-              <w:t>ГруппаАналоговЗакупок</w:t>
-            </w:r>
-          </w:p>
-        </w:tc>
-        <w:tc>
-          <w:tcPr>
-            <w:tcW w:type="dxa" w:w="1728"/>
-          </w:tcPr>
-          <w:p>
-            <w:r>
-              <w:t>3</w:t>
-            </w:r>
-          </w:p>
-        </w:tc>
-        <w:tc>
-          <w:tcPr>
-            <w:tcW w:type="dxa" w:w="1728"/>
-          </w:tcPr>
-          <w:p>
-            <w:r>
-              <w:t>33627</w:t>
-            </w:r>
-          </w:p>
-        </w:tc>
-        <w:tc>
-          <w:tcPr>
-            <w:tcW w:type="dxa" w:w="1728"/>
-          </w:tcPr>
-          <w:p>
-            <w:r>
-              <w:t>0.01%</w:t>
-            </w:r>
-          </w:p>
-        </w:tc>
-        <w:tc>
-          <w:tcPr>
-            <w:tcW w:type="dxa" w:w="1728"/>
-          </w:tcPr>
-          <w:p>
-            <w:r>
-              <w:t>Аналоги</w:t>
-            </w:r>
-          </w:p>
-        </w:tc>
-      </w:tr>
-      <w:tr>
-        <w:tc>
-          <w:tcPr>
-            <w:tcW w:type="dxa" w:w="1728"/>
-          </w:tcPr>
-          <w:p>
-            <w:r>
-              <w:t>ЕдиницаИзмеренияСрокаГодности</w:t>
-            </w:r>
-          </w:p>
-        </w:tc>
-        <w:tc>
-          <w:tcPr>
-            <w:tcW w:type="dxa" w:w="1728"/>
-          </w:tcPr>
-          <w:p>
-            <w:r>
-              <w:t>35</w:t>
-            </w:r>
-          </w:p>
-        </w:tc>
-        <w:tc>
-          <w:tcPr>
-            <w:tcW w:type="dxa" w:w="1728"/>
-          </w:tcPr>
-          <w:p>
-            <w:r>
-              <w:t>33595</w:t>
-            </w:r>
-          </w:p>
-        </w:tc>
-        <w:tc>
-          <w:tcPr>
-            <w:tcW w:type="dxa" w:w="1728"/>
-          </w:tcPr>
-          <w:p>
-            <w:r>
-              <w:t>0.1%</w:t>
-            </w:r>
-          </w:p>
-        </w:tc>
-        <w:tc>
-          <w:tcPr>
-            <w:tcW w:type="dxa" w:w="1728"/>
-          </w:tcPr>
-          <w:p>
-            <w:r>
-              <w:t>г</w:t>
-            </w:r>
-          </w:p>
-        </w:tc>
-      </w:tr>
-      <w:tr>
-        <w:tc>
-          <w:tcPr>
-            <w:tcW w:type="dxa" w:w="1728"/>
-          </w:tcPr>
-          <w:p>
-            <w:r>
-              <w:t>ТоварнаяКатегория</w:t>
-            </w:r>
-          </w:p>
-        </w:tc>
-        <w:tc>
-          <w:tcPr>
-            <w:tcW w:type="dxa" w:w="1728"/>
-          </w:tcPr>
-          <w:p>
-            <w:r>
-              <w:t>504</w:t>
-            </w:r>
-          </w:p>
-        </w:tc>
-        <w:tc>
-          <w:tcPr>
-            <w:tcW w:type="dxa" w:w="1728"/>
-          </w:tcPr>
-          <w:p>
-            <w:r>
-              <w:t>33126</w:t>
-            </w:r>
-          </w:p>
-        </w:tc>
-        <w:tc>
-          <w:tcPr>
-            <w:tcW w:type="dxa" w:w="1728"/>
-          </w:tcPr>
-          <w:p>
-            <w:r>
-              <w:t>1.5%</w:t>
-            </w:r>
-          </w:p>
-        </w:tc>
-        <w:tc>
-          <w:tcPr>
-            <w:tcW w:type="dxa" w:w="1728"/>
-          </w:tcPr>
-          <w:p>
-            <w:r>
-              <w:t>Косметические средства</w:t>
-            </w:r>
-          </w:p>
-        </w:tc>
-      </w:tr>
-      <w:tr>
-        <w:tc>
-          <w:tcPr>
-            <w:tcW w:type="dxa" w:w="1728"/>
-          </w:tcPr>
-          <w:p>
-            <w:r>
-              <w:t>НастройкаФормированияТоваровПродаваемыхСовместно</w:t>
-            </w:r>
-          </w:p>
-        </w:tc>
-        <w:tc>
-          <w:tcPr>
-            <w:tcW w:type="dxa" w:w="1728"/>
-          </w:tcPr>
-          <w:p>
-            <w:r>
-              <w:t>0</w:t>
-            </w:r>
-          </w:p>
-        </w:tc>
-        <w:tc>
-          <w:tcPr>
-            <w:tcW w:type="dxa" w:w="1728"/>
-          </w:tcPr>
-          <w:p>
-            <w:r>
-              <w:t>33630</w:t>
-            </w:r>
-          </w:p>
-        </w:tc>
-        <w:tc>
-          <w:tcPr>
-            <w:tcW w:type="dxa" w:w="1728"/>
-          </w:tcPr>
-          <w:p>
-            <w:r>
-              <w:t>0.0%</w:t>
-            </w:r>
-          </w:p>
-        </w:tc>
-        <w:tc>
-          <w:tcPr>
-            <w:tcW w:type="dxa" w:w="1728"/>
-          </w:tcPr>
-          <w:p>
-            <w:r/>
-          </w:p>
-        </w:tc>
-      </w:tr>
-      <w:tr>
-        <w:tc>
-          <w:tcPr>
-            <w:tcW w:type="dxa" w:w="1728"/>
-          </w:tcPr>
-          <w:p>
-            <w:r>
-              <w:t>Удалить_GTIN</w:t>
-            </w:r>
-          </w:p>
-        </w:tc>
-        <w:tc>
-          <w:tcPr>
-            <w:tcW w:type="dxa" w:w="1728"/>
-          </w:tcPr>
-          <w:p>
-            <w:r>
-              <w:t>0</w:t>
-            </w:r>
-          </w:p>
-        </w:tc>
-        <w:tc>
-          <w:tcPr>
-            <w:tcW w:type="dxa" w:w="1728"/>
-          </w:tcPr>
-          <w:p>
-            <w:r>
-              <w:t>33630</w:t>
-            </w:r>
-          </w:p>
-        </w:tc>
-        <w:tc>
-          <w:tcPr>
-            <w:tcW w:type="dxa" w:w="1728"/>
-          </w:tcPr>
-          <w:p>
-            <w:r>
-              <w:t>0.0%</w:t>
-            </w:r>
-          </w:p>
-        </w:tc>
-        <w:tc>
-          <w:tcPr>
-            <w:tcW w:type="dxa" w:w="1728"/>
-          </w:tcPr>
-          <w:p>
-            <w:r/>
-          </w:p>
-        </w:tc>
-      </w:tr>
-      <w:tr>
-        <w:tc>
-          <w:tcPr>
-            <w:tcW w:type="dxa" w:w="1728"/>
-          </w:tcPr>
-          <w:p>
-            <w:r>
-              <w:t>Артикул</w:t>
-            </w:r>
-          </w:p>
-        </w:tc>
-        <w:tc>
-          <w:tcPr>
-            <w:tcW w:type="dxa" w:w="1728"/>
-          </w:tcPr>
-          <w:p>
-            <w:r>
-              <w:t>7493</w:t>
-            </w:r>
-          </w:p>
-        </w:tc>
-        <w:tc>
-          <w:tcPr>
-            <w:tcW w:type="dxa" w:w="1728"/>
-          </w:tcPr>
-          <w:p>
-            <w:r>
-              <w:t>26137</w:t>
-            </w:r>
-          </w:p>
-        </w:tc>
-        <w:tc>
-          <w:tcPr>
-            <w:tcW w:type="dxa" w:w="1728"/>
-          </w:tcPr>
-          <w:p>
-            <w:r>
-              <w:t>22.28%</w:t>
-            </w:r>
-          </w:p>
-        </w:tc>
-        <w:tc>
-          <w:tcPr>
-            <w:tcW w:type="dxa" w:w="1728"/>
-          </w:tcPr>
-          <w:p>
-            <w:r>
-              <w:t>00000168799</w:t>
-            </w:r>
-          </w:p>
-        </w:tc>
-      </w:tr>
-      <w:tr>
-        <w:tc>
-          <w:tcPr>
-            <w:tcW w:type="dxa" w:w="1728"/>
-          </w:tcPr>
-          <w:p>
-            <w:r>
-              <w:t>КодВидаНоменклатурнойКлассификации</w:t>
-            </w:r>
-          </w:p>
-        </w:tc>
-        <w:tc>
-          <w:tcPr>
-            <w:tcW w:type="dxa" w:w="1728"/>
-          </w:tcPr>
-          <w:p>
-            <w:r>
-              <w:t>11894</w:t>
-            </w:r>
-          </w:p>
-        </w:tc>
-        <w:tc>
-          <w:tcPr>
-            <w:tcW w:type="dxa" w:w="1728"/>
-          </w:tcPr>
-          <w:p>
-            <w:r>
-              <w:t>21736</w:t>
-            </w:r>
-          </w:p>
-        </w:tc>
-        <w:tc>
-          <w:tcPr>
-            <w:tcW w:type="dxa" w:w="1728"/>
-          </w:tcPr>
-          <w:p>
-            <w:r>
-              <w:t>35.37%</w:t>
-            </w:r>
-          </w:p>
-        </w:tc>
-        <w:tc>
-          <w:tcPr>
-            <w:tcW w:type="dxa" w:w="1728"/>
-          </w:tcPr>
-          <w:p>
-            <w:r>
-              <w:t xml:space="preserve">             </w:t>
-            </w:r>
-          </w:p>
-        </w:tc>
-      </w:tr>
-      <w:tr>
-        <w:tc>
-          <w:tcPr>
-            <w:tcW w:type="dxa" w:w="1728"/>
-          </w:tcPr>
-          <w:p>
-            <w:r>
-              <w:t>ТипНоменклатуры</w:t>
-            </w:r>
-          </w:p>
-        </w:tc>
-        <w:tc>
-          <w:tcPr>
-            <w:tcW w:type="dxa" w:w="1728"/>
-          </w:tcPr>
-          <w:p>
-            <w:r>
-              <w:t>33510</w:t>
-            </w:r>
-          </w:p>
-        </w:tc>
-        <w:tc>
-          <w:tcPr>
-            <w:tcW w:type="dxa" w:w="1728"/>
+            <w:tcW w:type="dxa" w:w="1234"/>
           </w:tcPr>
           <w:p>
             <w:r>
@@ -2940,7 +2225,7 @@
         </w:tc>
         <w:tc>
           <w:tcPr>
-            <w:tcW w:type="dxa" w:w="1728"/>
+            <w:tcW w:type="dxa" w:w="1234"/>
           </w:tcPr>
           <w:p>
             <w:r>
@@ -2950,7 +2235,17 @@
         </w:tc>
         <w:tc>
           <w:tcPr>
-            <w:tcW w:type="dxa" w:w="1728"/>
+            <w:tcW w:type="dxa" w:w="1234"/>
+          </w:tcPr>
+          <w:p>
+            <w:r>
+              <w:t>0.33%</w:t>
+            </w:r>
+          </w:p>
+        </w:tc>
+        <w:tc>
+          <w:tcPr>
+            <w:tcW w:type="dxa" w:w="1234"/>
           </w:tcPr>
           <w:p>
             <w:r>
@@ -2962,27 +2257,37 @@
       <w:tr>
         <w:tc>
           <w:tcPr>
-            <w:tcW w:type="dxa" w:w="1728"/>
+            <w:tcW w:type="dxa" w:w="1234"/>
           </w:tcPr>
           <w:p>
             <w:r>
-              <w:t>ФармакотерапевтическаяГруппа</w:t>
+              <w:t>Противовоспалительные И Противоревматические Препа</w:t>
             </w:r>
           </w:p>
         </w:tc>
         <w:tc>
           <w:tcPr>
-            <w:tcW w:type="dxa" w:w="1728"/>
+            <w:tcW w:type="dxa" w:w="1234"/>
           </w:tcPr>
           <w:p>
             <w:r>
-              <w:t>8248</w:t>
+              <w:t>-</w:t>
             </w:r>
           </w:p>
         </w:tc>
         <w:tc>
           <w:tcPr>
-            <w:tcW w:type="dxa" w:w="1728"/>
+            <w:tcW w:type="dxa" w:w="1234"/>
+          </w:tcPr>
+          <w:p>
+            <w:r>
+              <w:t>8243</w:t>
+            </w:r>
+          </w:p>
+        </w:tc>
+        <w:tc>
+          <w:tcPr>
+            <w:tcW w:type="dxa" w:w="1234"/>
           </w:tcPr>
           <w:p>
             <w:r>
@@ -2992,21 +2297,31 @@
         </w:tc>
         <w:tc>
           <w:tcPr>
-            <w:tcW w:type="dxa" w:w="1728"/>
+            <w:tcW w:type="dxa" w:w="1234"/>
           </w:tcPr>
           <w:p>
             <w:r>
-              <w:t>24.53%</w:t>
+              <w:t>24.51%</w:t>
             </w:r>
           </w:p>
         </w:tc>
         <w:tc>
           <w:tcPr>
-            <w:tcW w:type="dxa" w:w="1728"/>
+            <w:tcW w:type="dxa" w:w="1234"/>
           </w:tcPr>
           <w:p>
             <w:r>
-              <w:t>Препараты Для Лечения Частого Мочеиспускания И Нед</w:t>
+              <w:t>7.1%</w:t>
+            </w:r>
+          </w:p>
+        </w:tc>
+        <w:tc>
+          <w:tcPr>
+            <w:tcW w:type="dxa" w:w="1234"/>
+          </w:tcPr>
+          <w:p>
+            <w:r>
+              <w:t xml:space="preserve">Кровезаменители И Перфузионные Растворы; Растворы </w:t>
             </w:r>
           </w:p>
         </w:tc>
@@ -3014,27 +2329,37 @@
       <w:tr>
         <w:tc>
           <w:tcPr>
-            <w:tcW w:type="dxa" w:w="1728"/>
+            <w:tcW w:type="dxa" w:w="1234"/>
           </w:tcPr>
           <w:p>
             <w:r>
-              <w:t>НаркотическоеВещество</w:t>
+              <w:t>Нет.5</w:t>
             </w:r>
           </w:p>
         </w:tc>
         <w:tc>
           <w:tcPr>
-            <w:tcW w:type="dxa" w:w="1728"/>
+            <w:tcW w:type="dxa" w:w="1234"/>
           </w:tcPr>
           <w:p>
             <w:r>
-              <w:t>33513</w:t>
+              <w:t>-</w:t>
             </w:r>
           </w:p>
         </w:tc>
         <w:tc>
           <w:tcPr>
-            <w:tcW w:type="dxa" w:w="1728"/>
+            <w:tcW w:type="dxa" w:w="1234"/>
+          </w:tcPr>
+          <w:p>
+            <w:r>
+              <w:t>33508</w:t>
+            </w:r>
+          </w:p>
+        </w:tc>
+        <w:tc>
+          <w:tcPr>
+            <w:tcW w:type="dxa" w:w="1234"/>
           </w:tcPr>
           <w:p>
             <w:r>
@@ -3044,7 +2369,7 @@
         </w:tc>
         <w:tc>
           <w:tcPr>
-            <w:tcW w:type="dxa" w:w="1728"/>
+            <w:tcW w:type="dxa" w:w="1234"/>
           </w:tcPr>
           <w:p>
             <w:r>
@@ -3054,7 +2379,17 @@
         </w:tc>
         <w:tc>
           <w:tcPr>
-            <w:tcW w:type="dxa" w:w="1728"/>
+            <w:tcW w:type="dxa" w:w="1234"/>
+          </w:tcPr>
+          <w:p>
+            <w:r>
+              <w:t>0.01%</w:t>
+            </w:r>
+          </w:p>
+        </w:tc>
+        <w:tc>
+          <w:tcPr>
+            <w:tcW w:type="dxa" w:w="1234"/>
           </w:tcPr>
           <w:p>
             <w:r>
@@ -3066,27 +2401,37 @@
       <w:tr>
         <w:tc>
           <w:tcPr>
-            <w:tcW w:type="dxa" w:w="1728"/>
+            <w:tcW w:type="dxa" w:w="1234"/>
           </w:tcPr>
           <w:p>
             <w:r>
-              <w:t>СильнодействующиеИЯды</w:t>
+              <w:t>Нет.6</w:t>
             </w:r>
           </w:p>
         </w:tc>
         <w:tc>
           <w:tcPr>
-            <w:tcW w:type="dxa" w:w="1728"/>
+            <w:tcW w:type="dxa" w:w="1234"/>
           </w:tcPr>
           <w:p>
             <w:r>
-              <w:t>33513</w:t>
+              <w:t>-</w:t>
             </w:r>
           </w:p>
         </w:tc>
         <w:tc>
           <w:tcPr>
-            <w:tcW w:type="dxa" w:w="1728"/>
+            <w:tcW w:type="dxa" w:w="1234"/>
+          </w:tcPr>
+          <w:p>
+            <w:r>
+              <w:t>33508</w:t>
+            </w:r>
+          </w:p>
+        </w:tc>
+        <w:tc>
+          <w:tcPr>
+            <w:tcW w:type="dxa" w:w="1234"/>
           </w:tcPr>
           <w:p>
             <w:r>
@@ -3096,7 +2441,7 @@
         </w:tc>
         <w:tc>
           <w:tcPr>
-            <w:tcW w:type="dxa" w:w="1728"/>
+            <w:tcW w:type="dxa" w:w="1234"/>
           </w:tcPr>
           <w:p>
             <w:r>
@@ -3106,7 +2451,17 @@
         </w:tc>
         <w:tc>
           <w:tcPr>
-            <w:tcW w:type="dxa" w:w="1728"/>
+            <w:tcW w:type="dxa" w:w="1234"/>
+          </w:tcPr>
+          <w:p>
+            <w:r>
+              <w:t>0.01%</w:t>
+            </w:r>
+          </w:p>
+        </w:tc>
+        <w:tc>
+          <w:tcPr>
+            <w:tcW w:type="dxa" w:w="1234"/>
           </w:tcPr>
           <w:p>
             <w:r>
@@ -3118,27 +2473,37 @@
       <w:tr>
         <w:tc>
           <w:tcPr>
-            <w:tcW w:type="dxa" w:w="1728"/>
+            <w:tcW w:type="dxa" w:w="1234"/>
           </w:tcPr>
           <w:p>
             <w:r>
-              <w:t>КодОКПД2</w:t>
+              <w:t>21.20.10.221</w:t>
             </w:r>
           </w:p>
         </w:tc>
         <w:tc>
           <w:tcPr>
-            <w:tcW w:type="dxa" w:w="1728"/>
+            <w:tcW w:type="dxa" w:w="1234"/>
           </w:tcPr>
           <w:p>
             <w:r>
-              <w:t>11071</w:t>
+              <w:t>-</w:t>
             </w:r>
           </w:p>
         </w:tc>
         <w:tc>
           <w:tcPr>
-            <w:tcW w:type="dxa" w:w="1728"/>
+            <w:tcW w:type="dxa" w:w="1234"/>
+          </w:tcPr>
+          <w:p>
+            <w:r>
+              <w:t>11066</w:t>
+            </w:r>
+          </w:p>
+        </w:tc>
+        <w:tc>
+          <w:tcPr>
+            <w:tcW w:type="dxa" w:w="1234"/>
           </w:tcPr>
           <w:p>
             <w:r>
@@ -3148,21 +2513,31 @@
         </w:tc>
         <w:tc>
           <w:tcPr>
-            <w:tcW w:type="dxa" w:w="1728"/>
+            <w:tcW w:type="dxa" w:w="1234"/>
           </w:tcPr>
           <w:p>
             <w:r>
-              <w:t>32.92%</w:t>
+              <w:t>32.91%</w:t>
             </w:r>
           </w:p>
         </w:tc>
         <w:tc>
           <w:tcPr>
-            <w:tcW w:type="dxa" w:w="1728"/>
+            <w:tcW w:type="dxa" w:w="1234"/>
           </w:tcPr>
           <w:p>
             <w:r>
-              <w:t>21.20.10.174</w:t>
+              <w:t>1.08%</w:t>
+            </w:r>
+          </w:p>
+        </w:tc>
+        <w:tc>
+          <w:tcPr>
+            <w:tcW w:type="dxa" w:w="1234"/>
+          </w:tcPr>
+          <w:p>
+            <w:r>
+              <w:t>21.20.10.134</w:t>
             </w:r>
           </w:p>
         </w:tc>
@@ -3170,27 +2545,37 @@
       <w:tr>
         <w:tc>
           <w:tcPr>
-            <w:tcW w:type="dxa" w:w="1728"/>
+            <w:tcW w:type="dxa" w:w="1234"/>
           </w:tcPr>
           <w:p>
             <w:r>
-              <w:t>Прослеживаемый</w:t>
+              <w:t>Нет.7</w:t>
             </w:r>
           </w:p>
         </w:tc>
         <w:tc>
           <w:tcPr>
-            <w:tcW w:type="dxa" w:w="1728"/>
+            <w:tcW w:type="dxa" w:w="1234"/>
           </w:tcPr>
           <w:p>
             <w:r>
-              <w:t>33513</w:t>
+              <w:t>-</w:t>
             </w:r>
           </w:p>
         </w:tc>
         <w:tc>
           <w:tcPr>
-            <w:tcW w:type="dxa" w:w="1728"/>
+            <w:tcW w:type="dxa" w:w="1234"/>
+          </w:tcPr>
+          <w:p>
+            <w:r>
+              <w:t>33508</w:t>
+            </w:r>
+          </w:p>
+        </w:tc>
+        <w:tc>
+          <w:tcPr>
+            <w:tcW w:type="dxa" w:w="1234"/>
           </w:tcPr>
           <w:p>
             <w:r>
@@ -3200,7 +2585,7 @@
         </w:tc>
         <w:tc>
           <w:tcPr>
-            <w:tcW w:type="dxa" w:w="1728"/>
+            <w:tcW w:type="dxa" w:w="1234"/>
           </w:tcPr>
           <w:p>
             <w:r>
@@ -3210,7 +2595,17 @@
         </w:tc>
         <w:tc>
           <w:tcPr>
-            <w:tcW w:type="dxa" w:w="1728"/>
+            <w:tcW w:type="dxa" w:w="1234"/>
+          </w:tcPr>
+          <w:p>
+            <w:r>
+              <w:t>0.0%</w:t>
+            </w:r>
+          </w:p>
+        </w:tc>
+        <w:tc>
+          <w:tcPr>
+            <w:tcW w:type="dxa" w:w="1234"/>
           </w:tcPr>
           <w:p>
             <w:r>
@@ -3222,77 +2617,37 @@
       <w:tr>
         <w:tc>
           <w:tcPr>
-            <w:tcW w:type="dxa" w:w="1728"/>
+            <w:tcW w:type="dxa" w:w="1234"/>
           </w:tcPr>
           <w:p>
             <w:r>
-              <w:t>УдалитьДозировка</w:t>
+              <w:t>ДИКЛОФЕНАК табл. 25 мг</w:t>
             </w:r>
           </w:p>
         </w:tc>
         <w:tc>
           <w:tcPr>
-            <w:tcW w:type="dxa" w:w="1728"/>
+            <w:tcW w:type="dxa" w:w="1234"/>
           </w:tcPr>
           <w:p>
             <w:r>
-              <w:t>0</w:t>
+              <w:t>-</w:t>
             </w:r>
           </w:p>
         </w:tc>
         <w:tc>
           <w:tcPr>
-            <w:tcW w:type="dxa" w:w="1728"/>
+            <w:tcW w:type="dxa" w:w="1234"/>
           </w:tcPr>
           <w:p>
             <w:r>
-              <w:t>33630</w:t>
+              <w:t>8244</w:t>
             </w:r>
           </w:p>
         </w:tc>
         <w:tc>
           <w:tcPr>
-            <w:tcW w:type="dxa" w:w="1728"/>
-          </w:tcPr>
-          <w:p>
-            <w:r>
-              <w:t>0.0%</w:t>
-            </w:r>
-          </w:p>
-        </w:tc>
-        <w:tc>
-          <w:tcPr>
-            <w:tcW w:type="dxa" w:w="1728"/>
-          </w:tcPr>
-          <w:p>
-            <w:r/>
-          </w:p>
-        </w:tc>
-      </w:tr>
-      <w:tr>
-        <w:tc>
-          <w:tcPr>
-            <w:tcW w:type="dxa" w:w="1728"/>
-          </w:tcPr>
-          <w:p>
-            <w:r>
-              <w:t>СМНН</w:t>
-            </w:r>
-          </w:p>
-        </w:tc>
-        <w:tc>
-          <w:tcPr>
-            <w:tcW w:type="dxa" w:w="1728"/>
-          </w:tcPr>
-          <w:p>
-            <w:r>
-              <w:t>8249</w:t>
-            </w:r>
-          </w:p>
-        </w:tc>
-        <w:tc>
-          <w:tcPr>
-            <w:tcW w:type="dxa" w:w="1728"/>
+            <w:tcW w:type="dxa" w:w="1234"/>
           </w:tcPr>
           <w:p>
             <w:r>
@@ -3302,21 +2657,31 @@
         </w:tc>
         <w:tc>
           <w:tcPr>
-            <w:tcW w:type="dxa" w:w="1728"/>
+            <w:tcW w:type="dxa" w:w="1234"/>
           </w:tcPr>
           <w:p>
             <w:r>
-              <w:t>24.53%</w:t>
+              <w:t>24.52%</w:t>
             </w:r>
           </w:p>
         </w:tc>
         <w:tc>
           <w:tcPr>
-            <w:tcW w:type="dxa" w:w="1728"/>
+            <w:tcW w:type="dxa" w:w="1234"/>
           </w:tcPr>
           <w:p>
             <w:r>
-              <w:t>СОЛИФЕНАЦИН табл. 10 мг</w:t>
+              <w:t>30.91%</w:t>
+            </w:r>
+          </w:p>
+        </w:tc>
+        <w:tc>
+          <w:tcPr>
+            <w:tcW w:type="dxa" w:w="1234"/>
+          </w:tcPr>
+          <w:p>
+            <w:r>
+              <w:t>КАЛИЯ ХЛОРИД+НАТРИЯ АЦЕТАТ+НАТРИЯ ХЛОРИД р-р 1 мг+</w:t>
             </w:r>
           </w:p>
         </w:tc>
@@ -3324,27 +2689,37 @@
       <w:tr>
         <w:tc>
           <w:tcPr>
-            <w:tcW w:type="dxa" w:w="1728"/>
+            <w:tcW w:type="dxa" w:w="1234"/>
           </w:tcPr>
           <w:p>
             <w:r>
-              <w:t>КодКЛП</w:t>
+              <w:t>21.20.10.221-000002-1-00083-2000000514080</w:t>
             </w:r>
           </w:p>
         </w:tc>
         <w:tc>
           <w:tcPr>
-            <w:tcW w:type="dxa" w:w="1728"/>
+            <w:tcW w:type="dxa" w:w="1234"/>
           </w:tcPr>
           <w:p>
             <w:r>
-              <w:t>8243</w:t>
+              <w:t>-</w:t>
             </w:r>
           </w:p>
         </w:tc>
         <w:tc>
           <w:tcPr>
-            <w:tcW w:type="dxa" w:w="1728"/>
+            <w:tcW w:type="dxa" w:w="1234"/>
+          </w:tcPr>
+          <w:p>
+            <w:r>
+              <w:t>8238</w:t>
+            </w:r>
+          </w:p>
+        </w:tc>
+        <w:tc>
+          <w:tcPr>
+            <w:tcW w:type="dxa" w:w="1234"/>
           </w:tcPr>
           <w:p>
             <w:r>
@@ -3354,21 +2729,31 @@
         </w:tc>
         <w:tc>
           <w:tcPr>
-            <w:tcW w:type="dxa" w:w="1728"/>
+            <w:tcW w:type="dxa" w:w="1234"/>
           </w:tcPr>
           <w:p>
             <w:r>
-              <w:t>24.51%</w:t>
+              <w:t>24.5%</w:t>
             </w:r>
           </w:p>
         </w:tc>
         <w:tc>
           <w:tcPr>
-            <w:tcW w:type="dxa" w:w="1728"/>
+            <w:tcW w:type="dxa" w:w="1234"/>
           </w:tcPr>
           <w:p>
             <w:r>
-              <w:t>21.20.10.174-000023-1-00019-2000001251228</w:t>
+              <w:t>98.52%</w:t>
+            </w:r>
+          </w:p>
+        </w:tc>
+        <w:tc>
+          <w:tcPr>
+            <w:tcW w:type="dxa" w:w="1234"/>
+          </w:tcPr>
+          <w:p>
+            <w:r>
+              <w:t>21.20.10.134-000018-1-00192-2000001321547</w:t>
             </w:r>
           </w:p>
         </w:tc>
@@ -3376,27 +2761,37 @@
       <w:tr>
         <w:tc>
           <w:tcPr>
-            <w:tcW w:type="dxa" w:w="1728"/>
+            <w:tcW w:type="dxa" w:w="1234"/>
           </w:tcPr>
           <w:p>
             <w:r>
-              <w:t>ЕдиницВоВторичнойУпаковке</w:t>
+              <w:t>30</w:t>
             </w:r>
           </w:p>
         </w:tc>
         <w:tc>
           <w:tcPr>
-            <w:tcW w:type="dxa" w:w="1728"/>
+            <w:tcW w:type="dxa" w:w="1234"/>
           </w:tcPr>
           <w:p>
             <w:r>
-              <w:t>8364</w:t>
+              <w:t>-</w:t>
             </w:r>
           </w:p>
         </w:tc>
         <w:tc>
           <w:tcPr>
-            <w:tcW w:type="dxa" w:w="1728"/>
+            <w:tcW w:type="dxa" w:w="1234"/>
+          </w:tcPr>
+          <w:p>
+            <w:r>
+              <w:t>8359</w:t>
+            </w:r>
+          </w:p>
+        </w:tc>
+        <w:tc>
+          <w:tcPr>
+            <w:tcW w:type="dxa" w:w="1234"/>
           </w:tcPr>
           <w:p>
             <w:r>
@@ -3406,21 +2801,31 @@
         </w:tc>
         <w:tc>
           <w:tcPr>
-            <w:tcW w:type="dxa" w:w="1728"/>
+            <w:tcW w:type="dxa" w:w="1234"/>
           </w:tcPr>
           <w:p>
             <w:r>
-              <w:t>24.87%</w:t>
+              <w:t>24.86%</w:t>
             </w:r>
           </w:p>
         </w:tc>
         <w:tc>
           <w:tcPr>
-            <w:tcW w:type="dxa" w:w="1728"/>
+            <w:tcW w:type="dxa" w:w="1234"/>
           </w:tcPr>
           <w:p>
             <w:r>
-              <w:t>60.0</w:t>
+              <w:t>3.45%</w:t>
+            </w:r>
+          </w:p>
+        </w:tc>
+        <w:tc>
+          <w:tcPr>
+            <w:tcW w:type="dxa" w:w="1234"/>
+          </w:tcPr>
+          <w:p>
+            <w:r>
+              <w:t>5600.0</w:t>
             </w:r>
           </w:p>
         </w:tc>
@@ -3428,51 +2833,71 @@
       <w:tr>
         <w:tc>
           <w:tcPr>
-            <w:tcW w:type="dxa" w:w="1728"/>
+            <w:tcW w:type="dxa" w:w="1234"/>
           </w:tcPr>
           <w:p>
             <w:r>
-              <w:t>КЛП</w:t>
+              <w:t>2025-03-20 15:08:32</w:t>
             </w:r>
           </w:p>
         </w:tc>
         <w:tc>
           <w:tcPr>
-            <w:tcW w:type="dxa" w:w="1728"/>
+            <w:tcW w:type="dxa" w:w="1234"/>
           </w:tcPr>
           <w:p>
             <w:r>
-              <w:t>270</w:t>
+              <w:t>-</w:t>
             </w:r>
           </w:p>
         </w:tc>
         <w:tc>
           <w:tcPr>
-            <w:tcW w:type="dxa" w:w="1728"/>
+            <w:tcW w:type="dxa" w:w="1234"/>
           </w:tcPr>
           <w:p>
             <w:r>
-              <w:t>33360</w:t>
+              <w:t>26252</w:t>
             </w:r>
           </w:p>
         </w:tc>
         <w:tc>
           <w:tcPr>
-            <w:tcW w:type="dxa" w:w="1728"/>
+            <w:tcW w:type="dxa" w:w="1234"/>
           </w:tcPr>
           <w:p>
             <w:r>
-              <w:t>0.8%</w:t>
+              <w:t>7373</w:t>
             </w:r>
           </w:p>
         </w:tc>
         <w:tc>
           <w:tcPr>
-            <w:tcW w:type="dxa" w:w="1728"/>
+            <w:tcW w:type="dxa" w:w="1234"/>
           </w:tcPr>
           <w:p>
             <w:r>
-              <w:t>Гелангин нова, р-р д/местн. прим. 0.1 %, фл. 200 м</w:t>
+              <w:t>78.07%</w:t>
+            </w:r>
+          </w:p>
+        </w:tc>
+        <w:tc>
+          <w:tcPr>
+            <w:tcW w:type="dxa" w:w="1234"/>
+          </w:tcPr>
+          <w:p>
+            <w:r>
+              <w:t>58.76%</w:t>
+            </w:r>
+          </w:p>
+        </w:tc>
+        <w:tc>
+          <w:tcPr>
+            <w:tcW w:type="dxa" w:w="1234"/>
+          </w:tcPr>
+          <w:p>
+            <w:r>
+              <w:t>2025-02-09 23:04:58</w:t>
             </w:r>
           </w:p>
         </w:tc>
@@ -3480,183 +2905,37 @@
       <w:tr>
         <w:tc>
           <w:tcPr>
-            <w:tcW w:type="dxa" w:w="1728"/>
+            <w:tcW w:type="dxa" w:w="1234"/>
           </w:tcPr>
           <w:p>
             <w:r>
-              <w:t>Автор</w:t>
+              <w:t>4603695000056, 4603695000056</w:t>
             </w:r>
           </w:p>
         </w:tc>
         <w:tc>
           <w:tcPr>
-            <w:tcW w:type="dxa" w:w="1728"/>
+            <w:tcW w:type="dxa" w:w="1234"/>
           </w:tcPr>
           <w:p>
             <w:r>
-              <w:t>21773</w:t>
+              <w:t>-</w:t>
             </w:r>
           </w:p>
         </w:tc>
         <w:tc>
           <w:tcPr>
-            <w:tcW w:type="dxa" w:w="1728"/>
+            <w:tcW w:type="dxa" w:w="1234"/>
           </w:tcPr>
           <w:p>
             <w:r>
-              <w:t>11857</w:t>
+              <w:t>29515</w:t>
             </w:r>
           </w:p>
         </w:tc>
         <w:tc>
           <w:tcPr>
-            <w:tcW w:type="dxa" w:w="1728"/>
-          </w:tcPr>
-          <w:p>
-            <w:r>
-              <w:t>64.74%</w:t>
-            </w:r>
-          </w:p>
-        </w:tc>
-        <w:tc>
-          <w:tcPr>
-            <w:tcW w:type="dxa" w:w="1728"/>
-          </w:tcPr>
-          <w:p>
-            <w:r>
-              <w:t>РУТКОД</w:t>
-            </w:r>
-          </w:p>
-        </w:tc>
-      </w:tr>
-      <w:tr>
-        <w:tc>
-          <w:tcPr>
-            <w:tcW w:type="dxa" w:w="1728"/>
-          </w:tcPr>
-          <w:p>
-            <w:r>
-              <w:t>ДатаСоздания</w:t>
-            </w:r>
-          </w:p>
-        </w:tc>
-        <w:tc>
-          <w:tcPr>
-            <w:tcW w:type="dxa" w:w="1728"/>
-          </w:tcPr>
-          <w:p>
-            <w:r>
-              <w:t>26253</w:t>
-            </w:r>
-          </w:p>
-        </w:tc>
-        <w:tc>
-          <w:tcPr>
-            <w:tcW w:type="dxa" w:w="1728"/>
-          </w:tcPr>
-          <w:p>
-            <w:r>
-              <w:t>7377</w:t>
-            </w:r>
-          </w:p>
-        </w:tc>
-        <w:tc>
-          <w:tcPr>
-            <w:tcW w:type="dxa" w:w="1728"/>
-          </w:tcPr>
-          <w:p>
-            <w:r>
-              <w:t>78.06%</w:t>
-            </w:r>
-          </w:p>
-        </w:tc>
-        <w:tc>
-          <w:tcPr>
-            <w:tcW w:type="dxa" w:w="1728"/>
-          </w:tcPr>
-          <w:p>
-            <w:r>
-              <w:t>2025-03-20 15:08:32</w:t>
-            </w:r>
-          </w:p>
-        </w:tc>
-      </w:tr>
-      <w:tr>
-        <w:tc>
-          <w:tcPr>
-            <w:tcW w:type="dxa" w:w="1728"/>
-          </w:tcPr>
-          <w:p>
-            <w:r>
-              <w:t>Комментарий</w:t>
-            </w:r>
-          </w:p>
-        </w:tc>
-        <w:tc>
-          <w:tcPr>
-            <w:tcW w:type="dxa" w:w="1728"/>
-          </w:tcPr>
-          <w:p>
-            <w:r>
-              <w:t>6596</w:t>
-            </w:r>
-          </w:p>
-        </w:tc>
-        <w:tc>
-          <w:tcPr>
-            <w:tcW w:type="dxa" w:w="1728"/>
-          </w:tcPr>
-          <w:p>
-            <w:r>
-              <w:t>27034</w:t>
-            </w:r>
-          </w:p>
-        </w:tc>
-        <w:tc>
-          <w:tcPr>
-            <w:tcW w:type="dxa" w:w="1728"/>
-          </w:tcPr>
-          <w:p>
-            <w:r>
-              <w:t>19.61%</w:t>
-            </w:r>
-          </w:p>
-        </w:tc>
-        <w:tc>
-          <w:tcPr>
-            <w:tcW w:type="dxa" w:w="1728"/>
-          </w:tcPr>
-          <w:p>
-            <w:r>
-              <w:t>Исходное название лекарственной формы (сокр.): таб</w:t>
-            </w:r>
-          </w:p>
-        </w:tc>
-      </w:tr>
-      <w:tr>
-        <w:tc>
-          <w:tcPr>
-            <w:tcW w:type="dxa" w:w="1728"/>
-          </w:tcPr>
-          <w:p>
-            <w:r>
-              <w:t>Штрихкод</w:t>
-            </w:r>
-          </w:p>
-        </w:tc>
-        <w:tc>
-          <w:tcPr>
-            <w:tcW w:type="dxa" w:w="1728"/>
-          </w:tcPr>
-          <w:p>
-            <w:r>
-              <w:t>29520</w:t>
-            </w:r>
-          </w:p>
-        </w:tc>
-        <w:tc>
-          <w:tcPr>
-            <w:tcW w:type="dxa" w:w="1728"/>
+            <w:tcW w:type="dxa" w:w="1234"/>
           </w:tcPr>
           <w:p>
             <w:r>
@@ -3666,7 +2945,7 @@
         </w:tc>
         <w:tc>
           <w:tcPr>
-            <w:tcW w:type="dxa" w:w="1728"/>
+            <w:tcW w:type="dxa" w:w="1234"/>
           </w:tcPr>
           <w:p>
             <w:r>
@@ -3676,11 +2955,21 @@
         </w:tc>
         <w:tc>
           <w:tcPr>
-            <w:tcW w:type="dxa" w:w="1728"/>
+            <w:tcW w:type="dxa" w:w="1234"/>
           </w:tcPr>
           <w:p>
             <w:r>
-              <w:t>4606486047940, 4606486047940</w:t>
+              <w:t>99.15%</w:t>
+            </w:r>
+          </w:p>
+        </w:tc>
+        <w:tc>
+          <w:tcPr>
+            <w:tcW w:type="dxa" w:w="1234"/>
+          </w:tcPr>
+          <w:p>
+            <w:r>
+              <w:t>4605453008946, 4605453008946</w:t>
             </w:r>
           </w:p>
         </w:tc>

</xml_diff>